<commit_message>
build: rebuild parallel-package DOCX for CĐ2/chapter finalization (Upper Echelons + concavity)
Regenerates dist/luan_an (02/03/04_05), dist/luan_an_ctu (chuong_2-5 +
LUAN_AN_FULL), dist/chuyen_de_1 (CĐ2), and the merged LUAN_AN_FULL + TOM_TAT
in dist/downloads from updated source.

https://claude.ai/code/session_01TNqoRFY1vAVQL6GWg8X9M3
</commit_message>
<xml_diff>
--- a/dist/downloads/LUAN_AN_FULL_vi.docx
+++ b/dist/downloads/LUAN_AN_FULL_vi.docx
@@ -2514,7 +2514,7 @@
         <w:pStyle w:val="BodyText"/>
       </w:pPr>
       <w:r>
-        <w:t xml:space="preserve">Một bước tinh chỉnh quan trọng đến từ Xu (2024), người phân tách quy tắc hình thức trên giấy (de jure) với thực thi thực tế (de facto), qua đó giải thích vì sao những nền kinh tế có khung pháp lý tương tự lại tạo ra kết quả kinh doanh rất khác nhau. Kim et al. (2026) cung cấp một khung đo lường năng lực thể chế (institutional capacity) theo hai chiều, chiều tổ chức gồm nhân sự, tài chính, hệ thống thông tin, quản lý, và chiều quản trị gồm minh bạch, độc lập, trách nhiệm giải trình; nghiên cứu đa quốc gia này xác nhận tương quan dương bền vững giữa năng lực thể chế và phát triển kinh tế. Về phía bằng chứng tổng hợp, Marano et al. (2016) trên 170 nghiên cứu thuộc 32 quốc gia cho thấy thể chế quốc gia nguồn điều tiết đáng kể quan hệ I-P, với khả năng dịch chuyển điểm uốn của đường cong; doanh nghiệp từ các nền kinh tế thể chế yếu hơn thường thu được lợi ích thấp hơn, thậm chí chịu tổn thất khi quốc tế hóa. Cuervo-Cazurra et al. (2018) bổ sung một góc nhìn khác: sự bất định thể chế ở quốc gia nguồn không chỉ là thách thức mà còn có thể rèn cho doanh nghiệp một năng lực quản lý bất định đặc thù, nhờ đó họ cạnh tranh hiệu quả hơn ở những thị trường nước ngoài có đặc điểm tương tự. Lý thuyết thể chế là nền tảng lý luận cho giả thuyết H5 và cho khung phân tích ICRV trình bày ở Mục 2.3.</w:t>
+        <w:t xml:space="preserve">Một bước tinh chỉnh quan trọng đến từ Xu (2024), người phân tách quy tắc hình thức trên giấy (de jure) với thực thi thực tế (de facto), qua đó giải thích vì sao những nền kinh tế có khung pháp lý tương tự lại tạo ra kết quả kinh doanh rất khác nhau. Kim et al. (2026) cung cấp một khung đo lường năng lực thể chế (institutional capacity) theo hai chiều, chiều tổ chức gồm nhân sự, tài chính, hệ thống thông tin, quản lý, và chiều quản trị gồm minh bạch, độc lập, trách nhiệm giải trình; nghiên cứu đa quốc gia này xác nhận tương quan dương bền vững giữa năng lực thể chế và phát triển kinh tế. Về phía bằng chứng tổng hợp, Marano et al. (2016) trên 170 nghiên cứu thuộc 32 quốc gia cho thấy thể chế quốc gia nguồn điều tiết đáng kể quan hệ I-P, với khả năng thay đổi độ cong của đường cong; doanh nghiệp từ các nền kinh tế thể chế yếu hơn thường thu được lợi ích thấp hơn, thậm chí chịu tổn thất khi quốc tế hóa. Cuervo-Cazurra et al. (2018) bổ sung một góc nhìn khác: sự bất định thể chế ở quốc gia nguồn không chỉ là thách thức mà còn có thể rèn cho doanh nghiệp một năng lực quản lý bất định đặc thù, nhờ đó họ cạnh tranh hiệu quả hơn ở những thị trường nước ngoài có đặc điểm tương tự. Lý thuyết thể chế là nền tảng lý luận cho giả thuyết H5 và cho khung phân tích ICRV trình bày ở Mục 2.3.</w:t>
       </w:r>
     </w:p>
     <w:bookmarkEnd w:id="47"/>
@@ -2540,7 +2540,25 @@
         <w:pStyle w:val="BodyText"/>
       </w:pPr>
       <w:r>
-        <w:t xml:space="preserve">Đặt trong bối cảnh quốc tế hóa, lý thuyết này có hai hàm ý trực tiếp. Một mặt, kinh nghiệm quốc tế của nhà quản trị cấp cao, đo bằng số năm làm việc hoặc học tập ở nước ngoài hay mức độ tiếp xúc với thị trường quốc tế, giúp giảm nhận thức về gánh nặng người nước ngoài và nâng cao khả năng đánh giá cơ hội, quản trị rủi ro ở thị trường quốc tế (Hsu et al., 2013; Sambharya, 1996). Mặt khác, sự đa dạng giới tính trong lãnh đạo, đặc biệt là sự hiện diện của quản trị viên nữ ở các vị trí lãnh đạo, gắn với nhận thức chiến lược đa chiều hơn và thực tiễn quản trị rủi ro thận trọng hơn, qua đó tác động tích cực đến hiệu quả doanh nghiệp trong quá trình quốc tế hóa (Post &amp; Byron, 2015). Hai hàm ý này là cơ sở lý thuyết cho giả thuyết H4 về vai trò của đặc điểm nhà quản trị cấp cao. Tuy nhiên, trên mẫu đa quốc gia quy mô lớn, khác biệt cấp doanh nghiệp về đặc điểm nhà quản trị nhiều khả năng nâng mặt bằng hiệu quả hơn là tái định hình toàn bộ độ cong của đường quan hệ I-P, vốn được chi phối chủ yếu bởi các yếu tố thể chế và mức độ trưởng thành thị trường ở cấp nền kinh tế (Do &amp; Phan, 2026d).</w:t>
+        <w:t xml:space="preserve">Đặt trong bối cảnh quốc tế hóa, lý thuyết này có hai hàm ý trực tiếp. Một mặt, kinh nghiệm quốc tế của nhà quản trị cấp cao, đo bằng số năm làm việc hoặc học tập ở nước ngoài hay mức độ tiếp xúc với thị trường quốc tế, giúp giảm nhận thức về gánh nặng người nước ngoài và nâng cao khả năng đánh giá cơ hội, quản trị rủi ro ở thị trường quốc tế (Hsu et al., 2013; Sambharya, 1996). Mặt khác, sự đa dạng giới tính trong lãnh đạo, đặc biệt là sự hiện diện của quản trị viên nữ ở các vị trí lãnh đạo, gắn với nhận thức chiến lược đa chiều hơn và thực tiễn quản trị rủi ro thận trọng hơn, qua đó tác động tích cực đến hiệu quả doanh nghiệp trong quá trình quốc tế hóa (Post &amp; Byron, 2015). Hai hàm ý này là cơ sở lý thuyết cho khối kiểm soát quản trị nội sinh H4. Tuy nhiên, trên mẫu đa quốc gia quy mô lớn, khác biệt cấp doanh nghiệp về đặc điểm nhà quản trị nhiều khả năng nâng mặt bằng hiệu quả hơn là tái định hình toàn bộ độ cong của đường quan hệ I-P, vốn được chi phối chủ yếu bởi các yếu tố thể chế và mức độ trưởng thành thị trường ở cấp nền kinh tế (Do &amp; Phan, 2026d). Vì lý do đó, và vì năng lực cùng sự đa dạng giới của nhà quản trị có thể đồng thời tác động đến quyết định xuất khẩu, đến năng lực công nghệ và đến năng suất, khung của luận án không nâng đặc điểm nhà quản trị thành một tầng điều tiết trọng tâm mà đưa kinh nghiệm, học vấn và giới tính vào như nhóm biến kiểm soát quản trị nội sinh. Để bảo vệ tính nhân quả thuần khiết của tương tác Thể chế × Công nghệ, các đặc điểm nhà quản trị (kinh nghiệm, học vấn, giới tính) được đưa vào như biến kiểm soát quản trị nội sinh, không phải nhân tố điều tiết trọng tâm của đường cong I-P; lựa chọn này tránh thiên lệch biến bị bỏ sót và ngăn hiện tượng</w:t>
+      </w:r>
+      <w:r>
+        <w:t xml:space="preserve"> </w:t>
+      </w:r>
+      <w:r>
+        <w:t xml:space="preserve">“</w:t>
+      </w:r>
+      <w:r>
+        <w:t xml:space="preserve">Kitchen Sink Modeling</w:t>
+      </w:r>
+      <w:r>
+        <w:t xml:space="preserve">”</w:t>
+      </w:r>
+      <w:r>
+        <w:t xml:space="preserve"> </w:t>
+      </w:r>
+      <w:r>
+        <w:t xml:space="preserve">làm loãng thông điệp vĩ mô Institution × Technology. Bốn nhân tố điều tiết trọng tâm của khung do đó là TCI (H2), DAI (H3), chế độ thể chế ICRV (H5) và thời gian (H6).</w:t>
       </w:r>
     </w:p>
     <w:bookmarkEnd w:id="48"/>
@@ -2847,7 +2865,7 @@
               <w:jc w:val="left"/>
             </w:pPr>
             <w:r>
-              <w:t xml:space="preserve">Chất lượng thể chế dịch chuyển vị trí điểm uốn</w:t>
+              <w:t xml:space="preserve">Chất lượng thể chế chi phối độ cong đường cong I-P</w:t>
             </w:r>
           </w:p>
         </w:tc>
@@ -2909,19 +2927,19 @@
               <w:jc w:val="left"/>
             </w:pPr>
             <w:r>
-              <w:t xml:space="preserve">Đặc điểm lãnh đạo nâng mặt bằng hiệu quả</w:t>
-            </w:r>
-          </w:p>
-        </w:tc>
-        <w:tc>
-          <w:tcPr/>
-          <w:p>
-            <w:pPr>
-              <w:pStyle w:val="Compact"/>
-              <w:jc w:val="left"/>
-            </w:pPr>
-            <w:r>
-              <w:t xml:space="preserve">H4</w:t>
+              <w:t xml:space="preserve">Đặc điểm lãnh đạo nâng mặt bằng hiệu quả (kiểm soát quản trị nội sinh, không phải điều tiết trọng tâm độ cong)</w:t>
+            </w:r>
+          </w:p>
+        </w:tc>
+        <w:tc>
+          <w:tcPr/>
+          <w:p>
+            <w:pPr>
+              <w:pStyle w:val="Compact"/>
+              <w:jc w:val="left"/>
+            </w:pPr>
+            <w:r>
+              <w:t xml:space="preserve">H4 (kiểm soát quản trị nội sinh)</w:t>
             </w:r>
           </w:p>
         </w:tc>
@@ -3615,7 +3633,7 @@
         <w:pStyle w:val="BodyText"/>
       </w:pPr>
       <w:r>
-        <w:t xml:space="preserve">Cơ chế điều tiết của ICRV vận hành theo hai kênh đan xen. Kênh thứ nhất là dịch chuyển điểm uốn: ở môi trường thể chế chất lượng cao, doanh nghiệp cần một tỷ trọng xuất khẩu thấp hơn để bù đắp chi phí quốc tế hóa, nên điểm uốn tối ưu xuất hiện sớm hơn; ngược lại, ở môi trường thể chế yếu, chi phí giao dịch xuyên biên giới cao đẩy điểm uốn ra muộn hơn (Do &amp; Phan, 2026d). Kênh thứ hai là thay thế số cho thể chế (digital-for-institutional substitution): nơi thể chế chính thức cung cấp đầy đủ cơ chế thực thi hợp đồng, bảo vệ sở hữu trí tuệ và thông tin thị trường, công cụ số chỉ bổ sung biên; nơi khoảng trống thể chế ngự trị, công cụ số lại trở thành một sự thay thế đáng kể cho các cơ chế chính thức còn thiếu, qua đó vai trò định hình đường cong của DAI mạnh hơn ở nhóm thể chế yếu (Do &amp; Phan, 2026d). Đây chính là cơ sở của giả thuyết H5 và là phần mở rộng đa quốc gia của logic khoảng trống thể chế (Khanna &amp; Palepu, 2010) vào lĩnh vực số.</w:t>
+        <w:t xml:space="preserve">Cơ chế điều tiết của ICRV vận hành theo hai kênh đan xen. Kênh thứ nhất là thay đổi độ cong (biên độ) của đường cong: ở môi trường thể chế yếu, chi phí giao dịch xuyên biên giới cao làm độ cong của hình chữ U ngược sâu hơn — hình phạt hiệu quả đối với quốc tế hóa quá mức trở nên gay gắt hơn; ngược lại, ở môi trường thể chế mạnh, đường cong phẳng hơn, gần như tuyến tính. Điểm uốn không dịch chuyển đơn điệu theo chất lượng thể chế mà phân tán quanh mức ~40% (Do &amp; Phan, 2026d). Kênh thứ hai là thay thế số cho thể chế (digital-for-institutional substitution): nơi thể chế chính thức cung cấp đầy đủ cơ chế thực thi hợp đồng, bảo vệ sở hữu trí tuệ và thông tin thị trường, công cụ số chỉ bổ sung biên; nơi khoảng trống thể chế ngự trị, công cụ số lại trở thành một sự thay thế đáng kể cho các cơ chế chính thức còn thiếu, qua đó vai trò định hình đường cong của DAI mạnh hơn ở nhóm thể chế yếu (Do &amp; Phan, 2026d). Đây chính là cơ sở của giả thuyết H5 và là phần mở rộng đa quốc gia của logic khoảng trống thể chế (Khanna &amp; Palepu, 2010) vào lĩnh vực số.</w:t>
       </w:r>
     </w:p>
     <w:p>
@@ -3906,10 +3924,7 @@
         <w:pStyle w:val="BodyText"/>
       </w:pPr>
       <w:r>
-        <w:t xml:space="preserve">Marano et al. (2016) là công trình tập trung vào thể chế toàn diện nhất, với 170 nghiên cứu thuộc 32 quốc gia, chứng minh rằng chất lượng thể chế quốc gia nguồn có thể dịch chuyển điểm uốn tới khoảng $</w:t>
-      </w:r>
-      <w:r>
-        <w:t xml:space="preserve">$15% FSTS; đây là nền tảng quan trọng nhất ủng hộ dải biến thiên ICRV trong giả thuyết H5, song nghiên cứu không phân tách TCI với DAI và không có dữ liệu sau 2015. Wu et al. (2022) tổng hợp 20 năm bằng chứng từ doanh nghiệp đa quốc gia thị trường mới nổi và tìm thấy điểm uốn thấp hơn so với doanh nghiệp từ nền kinh tế phát triển khoảng 12-18% FSTS, do khoảng cách về năng lực hấp thụ; nghiên cứu không kiểm định giai đoạn số hóa và không dùng dữ liệu vi mô WBES.</w:t>
+        <w:t xml:space="preserve">Marano et al. (2016) là công trình tập trung vào thể chế toàn diện nhất, với 170 nghiên cứu thuộc 32 quốc gia, chứng minh rằng chất lượng thể chế quốc gia nguồn điều tiết đáng kể quan hệ I-P; đây là nền tảng quan trọng nhất ủng hộ dải biến thiên ICRV trong giả thuyết H5, song nghiên cứu không phân tách TCI với DAI và không có dữ liệu sau 2015. Wu et al. (2022) tổng hợp 20 năm bằng chứng từ doanh nghiệp đa quốc gia thị trường mới nổi và tìm thấy điểm uốn thấp hơn so với doanh nghiệp từ nền kinh tế phát triển khoảng 12-18% FSTS, do khoảng cách về năng lực hấp thụ; nghiên cứu không kiểm định giai đoạn số hóa và không dùng dữ liệu vi mô WBES.</w:t>
       </w:r>
     </w:p>
     <w:p>
@@ -3935,7 +3950,7 @@
         <w:pStyle w:val="FirstParagraph"/>
       </w:pPr>
       <w:r>
-        <w:t xml:space="preserve">Châu Á vừa là bối cảnh quan trọng vừa rất đặc thù đối với nghiên cứu I-P, nhờ hai đặc điểm hiếm khi cùng xuất hiện ở bất kỳ khu vực nào khác. Đặc điểm đầu tiên là sự đa dạng thể chế gần như ngoại lệ trên thế giới: từ Singapore với chất lượng quản trị hàng đầu đến các nền kinh tế cận biên với chất lượng quản trị rất yếu, từ Nhật Bản và Hàn Quốc với nền kinh tế phát triển hoàn thiện đến các nền kinh tế đảo nhỏ Thái Bình Dương có quy mô siêu nhỏ và hạ tầng thể chế còn sơ khai (Khanna &amp; Palepu, 2010; Peng, 2003). Đặc điểm còn lại là tốc độ chuyển đổi số và hội nhập quốc tế rất chênh lệch giữa các quốc gia trong khu vực. Tổng hợp bằng chứng đơn quốc gia ở châu Á cho thấy một bức tranh phân mảnh: có nghiên cứu báo cáo quan hệ dương, có nghiên cứu tìm thấy chữ U ngược, lại có nghiên cứu cho kết quả null hoặc âm (Do &amp; Phan, 2026d). Phản ứng quen thuộc của tài liệu là viện đến bối cảnh như một biến điều tiết, nhưng cách làm đó để ngỏ câu hỏi sâu hơn: nếu quan hệ I-P là phi tuyến, thì điều gì quyết định vị trí điểm uốn, và vì sao vị trí đó khác nhau có hệ thống giữa các doanh nghiệp và nền kinh tế?</w:t>
+        <w:t xml:space="preserve">Châu Á vừa là bối cảnh quan trọng vừa rất đặc thù đối với nghiên cứu I-P, nhờ hai đặc điểm hiếm khi cùng xuất hiện ở bất kỳ khu vực nào khác. Đặc điểm đầu tiên là sự đa dạng thể chế gần như ngoại lệ trên thế giới: từ Singapore với chất lượng quản trị hàng đầu đến các nền kinh tế cận biên với chất lượng quản trị rất yếu, từ Nhật Bản và Hàn Quốc với nền kinh tế phát triển hoàn thiện đến các nền kinh tế đảo nhỏ Thái Bình Dương có quy mô siêu nhỏ và hạ tầng thể chế còn sơ khai (Khanna &amp; Palepu, 2010; Peng, 2003). Đặc điểm còn lại là tốc độ chuyển đổi số và hội nhập quốc tế rất chênh lệch giữa các quốc gia trong khu vực. Tổng hợp bằng chứng đơn quốc gia ở châu Á cho thấy một bức tranh phân mảnh: có nghiên cứu báo cáo quan hệ dương, có nghiên cứu tìm thấy chữ U ngược, lại có nghiên cứu cho kết quả null hoặc âm (Do &amp; Phan, 2026d). Phản ứng quen thuộc của tài liệu là viện đến bối cảnh như một biến điều tiết, nhưng cách làm đó để ngỏ câu hỏi sâu hơn: nếu quan hệ I-P là phi tuyến, thì điều gì quyết định hình dạng và độ cong của nó, và vì sao độ cong đó khác nhau có hệ thống giữa các doanh nghiệp và nền kinh tế?</w:t>
       </w:r>
     </w:p>
     <w:p>
@@ -4044,7 +4059,7 @@
         <w:pStyle w:val="BodyText"/>
       </w:pPr>
       <w:r>
-        <w:t xml:space="preserve">Ba khoảng trống này hội tụ vào một hướng giải quyết chung: cần phát triển và kiểm định một khung giải thích tích hợp đa tầng trên dữ liệu đa quốc gia đủ rộng và đủ đa dạng về thể chế để bao phủ toàn bộ dải biến thiên thể chế của châu Á. Luận án đề xuất khung CDCM (Context-Contingent Digital-and-Capability Model — Mô hình năng lực và chấp nhận số phụ thuộc bối cảnh), một khung lý thuyết tích hợp đa tầng kết hợp bốn thành phần: bối cảnh thể chế ở tầng vĩ mô, được vận hành hóa bằng ICRV; năng lực doanh nghiệp ở tầng tổ chức, với TCI và DAI tách riêng; đặc điểm nhà quản trị cấp cao ở tầng cá nhân; và lớp mở rộng năng lực số. Trong khung này, FSTS là biến độc lập chính và năng suất lao động là biến phụ thuộc.</w:t>
+        <w:t xml:space="preserve">Ba khoảng trống này hội tụ vào một hướng giải quyết chung: cần phát triển và kiểm định một khung giải thích tích hợp đa tầng trên dữ liệu đa quốc gia đủ rộng và đủ đa dạng về thể chế để bao phủ toàn bộ dải biến thiên thể chế của châu Á. Luận án đề xuất khung CDCM (Context-Contingent Digital-and-Capability Model — Mô hình năng lực và chấp nhận số phụ thuộc bối cảnh), một khung lý thuyết tích hợp đa tầng kết hợp bốn thành phần: bối cảnh thể chế ở tầng vĩ mô, được vận hành hóa bằng ICRV; năng lực doanh nghiệp ở tầng tổ chức, với TCI và DAI tách riêng; đặc điểm nhà quản trị cấp cao ở tầng cá nhân, đưa vào như khối kiểm soát quản trị nội sinh; và lớp mở rộng năng lực số. Trong khung này, FSTS là biến độc lập chính và năng suất lao động là biến phụ thuộc.</w:t>
       </w:r>
     </w:p>
     <w:bookmarkEnd w:id="60"/>
@@ -4062,15 +4077,15 @@
         <w:pStyle w:val="FirstParagraph"/>
       </w:pPr>
       <w:r>
-        <w:t xml:space="preserve">Mô hình khái niệm của luận án vận hành theo logic đa tầng: quan hệ trung tâm giữa quốc tế hóa (FSTS) và hiệu quả hoạt động kinh doanh, đo bằng năng suất lao động, được điều tiết đồng thời bởi ba tầng can thiệp, cùng với lớp mở rộng năng lực số xuyên suốt.</w:t>
-      </w:r>
-    </w:p>
-    <w:p>
-      <w:pPr>
-        <w:pStyle w:val="BodyText"/>
-      </w:pPr>
-      <w:r>
-        <w:t xml:space="preserve">Ở tầng vĩ mô là bối cảnh thể chế, được vận hành hóa bằng khung ICRV với sáu nhóm con theo dải biến thiên từ tiên tiến dẫn dắt bằng đổi mới đến đảo nhỏ Thái Bình Dương. Tại tầng này, ICRV điều tiết quan hệ I-P qua hai cơ chế đã nêu ở Mục 2.3: mức độ khoảng trống thể chế chi phối chi phí giao dịch xuyên biên giới, còn chất lượng thể chế chi phối vị trí điểm uốn. Ở các nền kinh tế cận biên và đảo nhỏ, khoảng trống thể chế quá lớn có thể đảo ngược quan hệ I-P, biến lợi ích tiềm năng thành tổn thất thực tế.</w:t>
+        <w:t xml:space="preserve">Mô hình khái niệm của luận án vận hành theo logic đa tầng: quan hệ trung tâm giữa quốc tế hóa (FSTS) và hiệu quả hoạt động kinh doanh, đo bằng năng suất lao động, được điều tiết bởi bốn nhân tố điều tiết trọng tâm là TCI (H2), DAI (H3), chế độ thể chế ICRV (H5) và thời gian (H6), cùng với lớp mở rộng năng lực số xuyên suốt; đặc điểm nhà quản trị cấp cao ở tầng cá nhân được đưa vào như khối kiểm soát quản trị nội sinh chứ không phải một tầng điều tiết trọng tâm.</w:t>
+      </w:r>
+    </w:p>
+    <w:p>
+      <w:pPr>
+        <w:pStyle w:val="BodyText"/>
+      </w:pPr>
+      <w:r>
+        <w:t xml:space="preserve">Ở tầng vĩ mô là bối cảnh thể chế, được vận hành hóa bằng khung ICRV với sáu nhóm con theo dải biến thiên từ tiên tiến dẫn dắt bằng đổi mới đến đảo nhỏ Thái Bình Dương. Tại tầng này, ICRV điều tiết quan hệ I-P qua hai cơ chế đã nêu ở Mục 2.3: mức độ khoảng trống thể chế chi phối chi phí giao dịch xuyên biên giới, còn chất lượng thể chế chi phối độ cong của đường cong. Ở các nền kinh tế cận biên và đảo nhỏ, khoảng trống thể chế quá lớn có thể đảo ngược quan hệ I-P, biến lợi ích tiềm năng thành tổn thất thực tế.</w:t>
       </w:r>
     </w:p>
     <w:p>
@@ -4086,7 +4101,7 @@
         <w:pStyle w:val="BodyText"/>
       </w:pPr>
       <w:r>
-        <w:t xml:space="preserve">Ở tầng cá nhân là đặc điểm nhà quản trị cấp cao, gồm kinh nghiệm quản trị và giới tính nhà quản trị, đóng vai trò các yếu tố nâng mặt bằng hiệu quả. Kinh nghiệm quốc tế của nhà quản trị giảm chi phí nhận thức của gánh nặng người nước ngoài; sự hiện diện của quản trị viên nữ làm tăng tính đa dạng nhận thức và sự thận trọng trong quản trị rủi ro quốc tế.</w:t>
+        <w:t xml:space="preserve">Ở tầng cá nhân là đặc điểm nhà quản trị cấp cao, gồm kinh nghiệm, học vấn và giới tính nhà quản trị, được đưa vào như khối kiểm soát quản trị nội sinh nâng mặt bằng hiệu quả, không phải nhân tố điều tiết trọng tâm định hình độ cong của đường quan hệ I-P. Kinh nghiệm quốc tế của nhà quản trị giảm chi phí nhận thức của gánh nặng người nước ngoài; sự hiện diện của quản trị viên nữ làm tăng tính đa dạng nhận thức và sự thận trọng trong quản trị rủi ro quốc tế. Vì năng lực và sự đa dạng giới của nhà quản trị có thể đồng thời tác động đến quyết định xuất khẩu, đến năng lực công nghệ và đến năng suất, việc kiểm soát các đặc điểm này, thay vì đặt chúng làm trục điều tiết, khóa chặt thiên lệch nội sinh và bảo vệ tính nhân quả thuần khiết của tương tác Thể chế × Công nghệ.</w:t>
       </w:r>
     </w:p>
     <w:p>
@@ -4248,23 +4263,23 @@
           <w:bCs/>
           <w:b/>
         </w:rPr>
-        <w:t xml:space="preserve">Giả thuyết H4 (điều tiết bởi đặc điểm nhà quản trị cấp cao).</w:t>
-      </w:r>
-      <w:r>
-        <w:t xml:space="preserve"> </w:t>
-      </w:r>
-      <w:r>
-        <w:t xml:space="preserve">Lý thuyết Bậc trên (Hambrick &amp; Mason, 1984; Hambrick, 2007) cho rằng các quyết định chiến lược, trong đó có quốc tế hóa, phản ánh đặc điểm nhận thức, kinh nghiệm và giá trị của nhà quản trị cấp cao. Hsu et al. (2013) cho thấy kinh nghiệm quốc tế của nhà quản trị nâng cao khả năng nhận diện cơ hội và giảm nhận thức về gánh nặng người nước ngoài; Post và Byron (2015) gắn sự hiện diện của lãnh đạo nữ với quản trị rủi ro thận trọng và ra quyết định đa chiều. Từ đó:</w:t>
-      </w:r>
-      <w:r>
-        <w:t xml:space="preserve"> </w:t>
-      </w:r>
-      <w:r>
-        <w:rPr>
-          <w:iCs/>
-          <w:i/>
-        </w:rPr>
-        <w:t xml:space="preserve">Kinh nghiệm quản trị và sự hiện diện của nhà quản trị nữ ở cấp cao làm mạnh thêm tác động tích cực của quốc tế hóa lên hiệu quả hoạt động, chủ yếu thông qua việc nâng mặt bằng hiệu quả, nhờ nâng cao nhận thức chiến lược quốc tế và quản trị rủi ro thận trọng hơn.</w:t>
+        <w:t xml:space="preserve">Giả thuyết H4 (kiểm soát quản trị nội sinh: đặc điểm nhà quản trị cấp cao).</w:t>
+      </w:r>
+      <w:r>
+        <w:t xml:space="preserve"> </w:t>
+      </w:r>
+      <w:r>
+        <w:t xml:space="preserve">Lý thuyết Bậc trên (Hambrick &amp; Mason, 1984; Hambrick, 2007) cho rằng các quyết định chiến lược, trong đó có quốc tế hóa, phản ánh đặc điểm nhận thức, kinh nghiệm và giá trị của nhà quản trị cấp cao. Hsu et al. (2013) cho thấy kinh nghiệm quốc tế của nhà quản trị nâng cao khả năng nhận diện cơ hội và giảm nhận thức về gánh nặng người nước ngoài; Post và Byron (2015) gắn sự hiện diện của lãnh đạo nữ với quản trị rủi ro thận trọng và ra quyết định đa chiều. Vì năng lực và sự đa dạng giới của nhà quản trị có thể đồng thời tác động đến quyết định xuất khẩu, đến năng lực công nghệ và đến năng suất, khung của luận án không nâng các đặc điểm này thành một trục điều tiết trọng tâm định hình độ cong của đường quan hệ I-P, mà đưa vào như nhóm biến kiểm soát quản trị nội sinh nhằm khóa chặt thiên lệch nội sinh và bảo vệ tính nhân quả thuần khiết của tương tác Thể chế × Công nghệ. Từ đó:</w:t>
+      </w:r>
+      <w:r>
+        <w:t xml:space="preserve"> </w:t>
+      </w:r>
+      <w:r>
+        <w:rPr>
+          <w:iCs/>
+          <w:i/>
+        </w:rPr>
+        <w:t xml:space="preserve">Kinh nghiệm quản trị và sự hiện diện của nhà quản trị nữ ở cấp cao nâng mặt bằng hiệu quả hoạt động và được đưa vào như nhóm biến kiểm soát quản trị nội sinh, không phải nhân tố điều tiết trọng tâm của đường cong I-P; ký hiệu H4 được giữ nguyên để tương thích với các bản thảo đồng hành (P3/P4/P5).</w:t>
       </w:r>
     </w:p>
     <w:p>
@@ -4282,7 +4297,7 @@
         <w:t xml:space="preserve"> </w:t>
       </w:r>
       <w:r>
-        <w:t xml:space="preserve">Lý thuyết thể chế (North, 1990; Khanna &amp; Palepu, 2010) cho rằng chất lượng thể chế quy định chi phí giao dịch và mức rủi ro mà doanh nghiệp phải gánh khi giao dịch xuyên biên giới, nên định hình lợi ích ròng của quốc tế hóa và vị trí điểm uốn. Marano et al. (2016) xác nhận thể chế quốc gia nguồn là biến điều tiết quan trọng nhất, có thể dịch chuyển điểm uốn đáng kể. Cơ chế là dải biến thiên của chi phí giao dịch, trong đó năng lực số có thể đóng vai trò thay thế một phần khoảng trống thể chế. Từ đó:</w:t>
+        <w:t xml:space="preserve">Lý thuyết thể chế (North, 1990; Khanna &amp; Palepu, 2010) cho rằng chất lượng thể chế quy định chi phí giao dịch và mức rủi ro mà doanh nghiệp phải gánh khi giao dịch xuyên biên giới, nên định hình lợi ích ròng của quốc tế hóa và độ cong của đường cong I-P. Marano et al. (2016) xác nhận thể chế quốc gia nguồn là biến điều tiết quan trọng nhất, có thể chi phối đáng kể độ cong của đường cong I-P. Cơ chế là dải biến thiên của chi phí giao dịch, trong đó năng lực số có thể đóng vai trò thay thế một phần khoảng trống thể chế. Từ đó:</w:t>
       </w:r>
       <w:r>
         <w:t xml:space="preserve"> </w:t>
@@ -4620,19 +4635,19 @@
               <w:jc w:val="left"/>
             </w:pPr>
             <w:r>
-              <w:t xml:space="preserve">H4</w:t>
-            </w:r>
-          </w:p>
-        </w:tc>
-        <w:tc>
-          <w:tcPr/>
-          <w:p>
-            <w:pPr>
-              <w:pStyle w:val="Compact"/>
-              <w:jc w:val="left"/>
-            </w:pPr>
-            <w:r>
-              <w:t xml:space="preserve">Đặc điểm nhà quản trị nâng mặt bằng</w:t>
+              <w:t xml:space="preserve">H4 (kiểm soát quản trị nội sinh)</w:t>
+            </w:r>
+          </w:p>
+        </w:tc>
+        <w:tc>
+          <w:tcPr/>
+          <w:p>
+            <w:pPr>
+              <w:pStyle w:val="Compact"/>
+              <w:jc w:val="left"/>
+            </w:pPr>
+            <w:r>
+              <w:t xml:space="preserve">Đặc điểm nhà quản trị nâng mặt bằng (kiểm soát quản trị nội sinh, không điều tiết độ cong)</w:t>
             </w:r>
           </w:p>
         </w:tc>
@@ -4682,7 +4697,7 @@
               <w:jc w:val="left"/>
             </w:pPr>
             <w:r>
-              <w:t xml:space="preserve">ICRV dịch chuyển điểm uốn</w:t>
+              <w:t xml:space="preserve">ICRV chi phối độ cong đường cong I-P</w:t>
             </w:r>
           </w:p>
         </w:tc>
@@ -4777,7 +4792,7 @@
         <w:pStyle w:val="FirstParagraph"/>
       </w:pPr>
       <w:r>
-        <w:t xml:space="preserve">Ba khoảng trống dẫn về một chương trình kiểm định gồm ba mảnh ghép bổ sung cho nhau. Khoảng trống thứ nhất và thứ ba cùng dẫn về câu hỏi liệu CDCM có giải thích đồng thời sự dị biệt của quan hệ I-P khi kiểm soát đầy đủ cả ba tầng trong một mô hình tích hợp, ở quy mô đủ rộng để bao phủ toàn bộ dải biến thiên ICRV hay không. Nghiên cứu P7 lấp khoảng trống này bằng dữ liệu WBES từ 45 nền kinh tế (N = 82.302-98.658 doanh nghiệp, 98 đợt quốc gia-năm), bao phủ toàn bộ dải biến thiên ICRV, kiểm định đồng thời H1-H6 với hiệu ứng cố định quốc gia-năm; điểm uốn trung bình khoảng 36% FSTS tại P7 thấp hơn so với Việt Nam (39-46%) và Trung Quốc (47-49%), qua đó xác nhận ICRV điều tiết vị trí điểm uốn đúng theo dải biến thiên mà lý thuyết dự đoán (Do &amp; Phan, 2026d). Khoảng trống thứ ba còn đòi hỏi kiểm định một điều kiện biên cực trị, đó là liệu có tồn tại bối cảnh nơi chữ U ngược sụp đổ hoàn toàn thành quan hệ âm đơn điệu hay không; Nghiên cứu P8 kiểm định H1b bằng dữ liệu WBES từ các nền kinh tế đảo nhỏ Thái Bình Dương, nơi ba điều kiện cấu trúc cơ bản của chữ U ngược cùng bị vi phạm (Do &amp; Phan, 2026b). Cùng với phân tích tổng hợp P6, ba mảnh ghép này tạo thành một chiến lược kiểm định toàn diện, từ tổng hợp bằng chứng quá khứ đến kiểm định tích hợp đa quốc gia và xác định điều kiện biên.</w:t>
+        <w:t xml:space="preserve">Ba khoảng trống dẫn về một chương trình kiểm định gồm ba mảnh ghép bổ sung cho nhau. Khoảng trống thứ nhất và thứ ba cùng dẫn về câu hỏi liệu CDCM có giải thích đồng thời sự dị biệt của quan hệ I-P khi kiểm soát đầy đủ cả ba tầng trong một mô hình tích hợp, ở quy mô đủ rộng để bao phủ toàn bộ dải biến thiên ICRV hay không. Nghiên cứu P7 lấp khoảng trống này bằng dữ liệu WBES từ 45 nền kinh tế (N = 82.302-98.658 doanh nghiệp, 98 đợt quốc gia-năm), bao phủ toàn bộ dải biến thiên ICRV, kiểm định đồng thời H1-H6 với hiệu ứng cố định quốc gia-năm; điểm uốn trung bình khoảng 36% FSTS tại P7 thấp hơn so với Việt Nam (39-46%) và Trung Quốc (47-49%) cho thấy điểm uốn cấp quốc gia biến thiên theo bối cảnh thể chế, nhất quán với việc ICRV chi phối hình dạng (độ cong) của quan hệ I-P như lý thuyết dự đoán (Do &amp; Phan, 2026d). Khoảng trống thứ ba còn đòi hỏi kiểm định một điều kiện biên cực trị, đó là liệu có tồn tại bối cảnh nơi chữ U ngược sụp đổ hoàn toàn thành quan hệ âm đơn điệu hay không; Nghiên cứu P8 kiểm định H1b bằng dữ liệu WBES từ các nền kinh tế đảo nhỏ Thái Bình Dương, nơi ba điều kiện cấu trúc cơ bản của chữ U ngược cùng bị vi phạm (Do &amp; Phan, 2026b). Cùng với phân tích tổng hợp P6, ba mảnh ghép này tạo thành một chiến lược kiểm định toàn diện, từ tổng hợp bằng chứng quá khứ đến kiểm định tích hợp đa quốc gia và xác định điều kiện biên.</w:t>
       </w:r>
     </w:p>
     <w:p>
@@ -4811,7 +4826,7 @@
         <w:pStyle w:val="BodyText"/>
       </w:pPr>
       <w:r>
-        <w:t xml:space="preserve">Phần đầu chương xác lập năm khái niệm cốt lõi: quốc tế hóa doanh nghiệp, hiệu quả hoạt động kinh doanh đo chủ yếu bằng năng suất lao động, cường độ xuất khẩu đo bằng FSTS, năng lực công nghệ (TCI) và mức độ chấp nhận số (DAI) như hai cấu trúc khái niệm độc lập. Phần lý thuyết nền phân tích bốn lý thuyết kinh điển là Uppsala, RBV, lý thuyết thể chế và lý thuyết Bậc trên, cùng lớp mở rộng là lăng kính số, đồng thời xác định vai trò của từng lý thuyết trong khung giải thích tổng thể. Khung phân tích ICRV được trình bày như một công cụ vận hành hóa bối cảnh thể chế thành sáu nhóm chế độ, đóng vai trò điều tiết quan hệ I-P qua cơ chế dịch chuyển điểm uốn và thay thế số cho thể chế.</w:t>
+        <w:t xml:space="preserve">Phần đầu chương xác lập năm khái niệm cốt lõi: quốc tế hóa doanh nghiệp, hiệu quả hoạt động kinh doanh đo chủ yếu bằng năng suất lao động, cường độ xuất khẩu đo bằng FSTS, năng lực công nghệ (TCI) và mức độ chấp nhận số (DAI) như hai cấu trúc khái niệm độc lập. Phần lý thuyết nền phân tích bốn lý thuyết kinh điển là Uppsala, RBV, lý thuyết thể chế và lý thuyết Bậc trên, cùng lớp mở rộng là lăng kính số, đồng thời xác định vai trò của từng lý thuyết trong khung giải thích tổng thể. Khung phân tích ICRV được trình bày như một công cụ vận hành hóa bối cảnh thể chế thành sáu nhóm chế độ, đóng vai trò điều tiết quan hệ I-P qua cơ chế thay đổi độ cong (biên độ) và thay thế số cho thể chế.</w:t>
       </w:r>
     </w:p>
     <w:p>
@@ -5827,13 +5842,13 @@
       </w:r>
     </w:p>
     <w:bookmarkEnd w:id="79"/>
-    <w:bookmarkStart w:id="80" w:name="đặc-điểm-nhà-quản-trị-cấp-cao"/>
+    <w:bookmarkStart w:id="80" w:name="Xfb44f2024dccf47e8995eec793f94f6e82c83b5"/>
     <w:p>
       <w:pPr>
         <w:pStyle w:val="Heading4"/>
       </w:pPr>
       <w:r>
-        <w:t xml:space="preserve">Đặc điểm nhà quản trị cấp cao</w:t>
+        <w:t xml:space="preserve">Đặc điểm nhà quản trị cấp cao (kiểm soát quản trị nội sinh H4)</w:t>
       </w:r>
     </w:p>
     <w:p>
@@ -5845,10 +5860,10 @@
           <w:bCs/>
           <w:b/>
         </w:rPr>
-        <w:t xml:space="preserve">Biến chính</w:t>
-      </w:r>
-      <w:r>
-        <w:t xml:space="preserve">: kinh nghiệm nhà quản trị cấp cao (số năm), giới tính nhà quản trị cấp cao (nữ/nam).</w:t>
+        <w:t xml:space="preserve">Biến kiểm soát</w:t>
+      </w:r>
+      <w:r>
+        <w:t xml:space="preserve">: kinh nghiệm nhà quản trị cấp cao (số năm), học vấn nhà quản trị cấp cao, giới tính nhà quản trị cấp cao (nữ/nam). Ba biến này được đưa vào như nhóm biến kiểm soát quản trị nội sinh, ở dạng số hạng chính nâng mặt bằng hiệu quả, không phải nhân tố điều tiết trọng tâm định hình độ cong của đường quan hệ I-P. Để bảo vệ tính nhân quả thuần khiết của tương tác Thể chế × Công nghệ, các đặc điểm nhà quản trị (kinh nghiệm, học vấn, giới tính) được đưa vào như biến kiểm soát quản trị nội sinh, không phải nhân tố điều tiết trọng tâm của đường cong I-P; ký hiệu H4 được giữ nguyên để tương thích với các bản thảo đồng hành (P3/P4/P5). Số hạng tương tác với FSTS chỉ được báo cáo như chẩn đoán phụ trợ, không phải bằng chứng điều tiết trọng tâm.</w:t>
       </w:r>
     </w:p>
     <w:p>
@@ -7719,7 +7734,7 @@
         <w:t xml:space="preserve"> </w:t>
       </w:r>
       <w:r>
-        <w:t xml:space="preserve">= số hóa,</w:t>
+        <w:t xml:space="preserve">= số hóa (DAI),</w:t>
       </w:r>
       <w:r>
         <w:t xml:space="preserve"> </w:t>
@@ -7733,7 +7748,7 @@
         <w:t xml:space="preserve"> </w:t>
       </w:r>
       <w:r>
-        <w:t xml:space="preserve">= thể chế,</w:t>
+        <w:t xml:space="preserve">= thể chế (ICRV) là hai nhân tố điều tiết trọng tâm, và</w:t>
       </w:r>
       <w:r>
         <w:t xml:space="preserve"> </w:t>
@@ -7747,7 +7762,7 @@
         <w:t xml:space="preserve"> </w:t>
       </w:r>
       <w:r>
-        <w:t xml:space="preserve">= nhà quản trị.</w:t>
+        <w:t xml:space="preserve">= đặc điểm nhà quản trị được đưa vào như khối kiểm soát quản trị nội sinh.</w:t>
       </w:r>
     </w:p>
     <w:p>
@@ -7777,7 +7792,7 @@
         <w:t xml:space="preserve">Đóng góp mới</w:t>
       </w:r>
       <w:r>
-        <w:t xml:space="preserve">: điều tiết ba chiều số hóa × thể chế × nhà quản trị trong bối cảnh châu Á và Thái Bình Dương với 47 nước chưa được kiểm định trước đây.</w:t>
+        <w:t xml:space="preserve">: điều tiết trọng tâm số hóa × thể chế (DAI × ICRV) trong bối cảnh châu Á và Thái Bình Dương với 47 nước chưa được kiểm định trước đây, với đặc điểm nhà quản trị giữ vai trò kiểm soát quản trị nội sinh nhằm bảo vệ tính nhân quả thuần khiết của tương tác Thể chế × Công nghệ.</w:t>
       </w:r>
     </w:p>
     <w:bookmarkEnd w:id="88"/>
@@ -15864,7 +15879,7 @@
         <w:t xml:space="preserve"> </w:t>
       </w:r>
       <w:r>
-        <w:t xml:space="preserve">(102 cặp quốc gia × năm, 2003-2025). Mẫu phân tích toàn phần đạt N = 82.302 (M0-M2) đến N = 28.500 (M11 đầy đủ). Thiết kế OLS phân cấp với sai số chuẩn vững HC1, gom cụm theo quốc gia–năm. Ký hiệu tiếng Việt:</w:t>
+        <w:t xml:space="preserve">(98 cặp quốc gia × năm, 2003-2025). Mẫu phân tích toàn phần đạt N = 82.302 (M0-M2) đến N = 28.500 (M11 đầy đủ). Thiết kế OLS phân cấp với sai số chuẩn vững HC1, gom cụm theo quốc gia–năm. Ký hiệu tiếng Việt:</w:t>
       </w:r>
     </w:p>
     <w:p>
@@ -18157,7 +18172,7 @@
         <w:t xml:space="preserve"> </w:t>
       </w:r>
       <w:r>
-        <w:t xml:space="preserve">(M8 + đặc điểm nhà quản lý, kiểm định H4):</w:t>
+        <w:t xml:space="preserve">(M8 + đặc điểm nhà quản lý như kiểm soát quản trị nội sinh H4):</w:t>
       </w:r>
     </w:p>
     <w:p>
@@ -18425,7 +18440,82 @@
               <m:nor/>
               <m:sty m:val="p"/>
             </m:rPr>
-            <m:t> (nhà quản trị cấp cao là nữ: lợi thế hiệu quả  17–20%xuyên bối cảnh)</m:t>
+            <m:t> (nhà quản trị cấp cao là nữ: hiệu ứng nâng mặt bằng, lợi thế hiệu quả  17–20%xuyên bối cảnh)</m:t>
+          </m:r>
+        </m:oMath>
+      </m:oMathPara>
+    </w:p>
+    <w:p>
+      <w:pPr>
+        <w:pStyle w:val="FirstParagraph"/>
+      </w:pPr>
+      <m:oMathPara>
+        <m:oMathParaPr>
+          <m:jc m:val="center"/>
+        </m:oMathParaPr>
+        <m:oMath>
+          <m:r>
+            <m:rPr>
+              <m:nor/>
+              <m:sty m:val="p"/>
+            </m:rPr>
+            <m:t>Số hạng </m:t>
+          </m:r>
+          <m:sSub>
+            <m:e>
+              <m:r>
+                <m:t>β</m:t>
+              </m:r>
+            </m:e>
+            <m:sub>
+              <m:r>
+                <m:t>9</m:t>
+              </m:r>
+            </m:sub>
+          </m:sSub>
+          <m:r>
+            <m:rPr>
+              <m:sty m:val="p"/>
+            </m:rPr>
+            <m:t>,</m:t>
+          </m:r>
+          <m:sSub>
+            <m:e>
+              <m:r>
+                <m:t>β</m:t>
+              </m:r>
+            </m:e>
+            <m:sub>
+              <m:r>
+                <m:t>10</m:t>
+              </m:r>
+            </m:sub>
+          </m:sSub>
+          <m:r>
+            <m:rPr>
+              <m:nor/>
+              <m:sty m:val="p"/>
+            </m:rPr>
+            <m:t> là kiểm soát mức; số hạng tương tác </m:t>
+          </m:r>
+          <m:sSub>
+            <m:e>
+              <m:r>
+                <m:t>β</m:t>
+              </m:r>
+            </m:e>
+            <m:sub>
+              <m:r>
+                <m:t>11</m:t>
+              </m:r>
+            </m:sub>
+          </m:sSub>
+          <m:r>
+            <m:rPr>
+              <m:nor/>
+              <m:sty m:val="p"/>
+            </m:rPr>
+            <m:t> chỉ là chẩn đoán phụ trợ, không phải bằng chứng điều tiết trọng tâm.</m:t>
           </m:r>
         </m:oMath>
       </m:oMathPara>
@@ -18835,39 +18925,100 @@
             </m:rPr>
             <m:t>H5: </m:t>
           </m:r>
-          <m:r>
-            <m:t>T</m:t>
-          </m:r>
-          <m:r>
-            <m:t>P</m:t>
-          </m:r>
+          <m:d>
+            <m:dPr>
+              <m:begChr m:val="|"/>
+              <m:endChr m:val="|"/>
+              <m:sepChr m:val=""/>
+              <m:grow/>
+            </m:dPr>
+            <m:e>
+              <m:sSub>
+                <m:e>
+                  <m:r>
+                    <m:t>β</m:t>
+                  </m:r>
+                </m:e>
+                <m:sub>
+                  <m:r>
+                    <m:t>2</m:t>
+                  </m:r>
+                </m:sub>
+              </m:sSub>
+            </m:e>
+          </m:d>
           <m:r>
             <m:rPr>
               <m:nor/>
               <m:sty m:val="p"/>
             </m:rPr>
-            <m:t> tăng khi ICRV tăng (thể chế yếu hơn): Group I</m:t>
+            <m:t> (độ cong) tăng khi ICRV tăng (thể chế yếu hơn): </m:t>
+          </m:r>
+          <m:r>
+            <m:t>C</m:t>
+          </m:r>
+          <m:r>
+            <m:t>D</m:t>
+          </m:r>
+          <m:r>
+            <m:t>D</m:t>
+          </m:r>
+          <m:r>
+            <m:t>X</m:t>
+          </m:r>
+          <m:r>
+            <m:t>K</m:t>
           </m:r>
           <m:r>
             <m:rPr>
               <m:sty m:val="p"/>
             </m:rPr>
-            <m:t>≈</m:t>
-          </m:r>
-          <m:r>
-            <m:t>28</m:t>
-          </m:r>
+            <m:t>_</m:t>
+          </m:r>
+          <m:sSup>
+            <m:e>
+              <m:r>
+                <m:t>c</m:t>
+              </m:r>
+            </m:e>
+            <m:sup>
+              <m:r>
+                <m:t>2</m:t>
+              </m:r>
+            </m:sup>
+          </m:sSup>
           <m:r>
             <m:rPr>
               <m:sty m:val="p"/>
             </m:rPr>
-            <m:t>%</m:t>
+            <m:t>×</m:t>
+          </m:r>
+          <m:r>
+            <m:t>I</m:t>
+          </m:r>
+          <m:r>
+            <m:t>C</m:t>
+          </m:r>
+          <m:r>
+            <m:t>R</m:t>
+          </m:r>
+          <m:r>
+            <m:t>V</m:t>
           </m:r>
           <m:r>
             <m:rPr>
               <m:sty m:val="p"/>
             </m:rPr>
-            <m:t>,</m:t>
+            <m:t>&lt;</m:t>
+          </m:r>
+          <m:r>
+            <m:t>0</m:t>
+          </m:r>
+          <m:r>
+            <m:rPr>
+              <m:sty m:val="p"/>
+            </m:rPr>
+            <m:t>;</m:t>
           </m:r>
           <m:r>
             <m:t> </m:t>
@@ -18877,22 +19028,7 @@
               <m:nor/>
               <m:sty m:val="p"/>
             </m:rPr>
-            <m:t>Group V–VI</m:t>
-          </m:r>
-          <m:r>
-            <m:rPr>
-              <m:sty m:val="p"/>
-            </m:rPr>
-            <m:t>≈</m:t>
-          </m:r>
-          <m:r>
-            <m:t>55</m:t>
-          </m:r>
-          <m:r>
-            <m:rPr>
-              <m:sty m:val="p"/>
-            </m:rPr>
-            <m:t>%</m:t>
+            <m:t>điểm uốn không dịch chuyển đơn điệu</m:t>
           </m:r>
         </m:oMath>
       </m:oMathPara>
@@ -19771,7 +19907,7 @@
           <m:sSup>
             <m:e>
               <m:r>
-                <m:t>012</m:t>
+                <m:t>049</m:t>
               </m:r>
             </m:e>
             <m:sup>
@@ -19821,7 +19957,7 @@
             <m:t>=</m:t>
           </m:r>
           <m:r>
-            <m:t>34</m:t>
+            <m:t>25</m:t>
           </m:r>
           <m:r>
             <m:rPr>
@@ -19830,7 +19966,7 @@
             <m:t>,</m:t>
           </m:r>
           <m:r>
-            <m:t>6</m:t>
+            <m:t>7</m:t>
           </m:r>
           <m:r>
             <m:rPr>
@@ -19870,7 +20006,7 @@
             <m:t>,</m:t>
           </m:r>
           <m:r>
-            <m:t>002</m:t>
+            <m:t>026</m:t>
           </m:r>
         </m:oMath>
       </m:oMathPara>
@@ -24426,7 +24562,7 @@
               <w:jc w:val="left"/>
             </w:pPr>
             <w:r>
-              <w:t xml:space="preserve">Điều tiết ba chiều</w:t>
+              <w:t xml:space="preserve">Điều tiết trọng tâm số hóa × thể chế</w:t>
             </w:r>
           </w:p>
         </w:tc>
@@ -24450,7 +24586,7 @@
               <w:jc w:val="left"/>
             </w:pPr>
             <w:r>
-              <w:t xml:space="preserve">số hóa × thể chế × nhà quản trị, mới cho châu Á và Thái Bình Dương</w:t>
+              <w:t xml:space="preserve">DAI × ICRV, mới cho châu Á và Thái Bình Dương; đặc điểm nhà quản trị giữ vai trò kiểm soát quản trị nội sinh</w:t>
             </w:r>
           </w:p>
         </w:tc>
@@ -24728,7 +24864,7 @@
         <w:t xml:space="preserve"> </w:t>
       </w:r>
       <w:r>
-        <w:t xml:space="preserve">— hàm ý rằng phần lớn bằng chứng I-P tích lũy suốt bốn thập kỷ có thể đã bị thổi phồng (một ước lượng trim-and-fill, được trình bày kèm rào đón phương pháp ở Mục 4.2.4). Thứ hai, bằng chứng đa quốc gia (P7) cho thấy điểm uốn tối ưu không cố định mà</w:t>
+        <w:t xml:space="preserve">— hàm ý rằng phần lớn bằng chứng I-P tích lũy suốt bốn thập kỷ có thể đã bị thổi phồng (một ước lượng trim-and-fill, được trình bày kèm rào đón phương pháp ở Mục 4.2.4). Thứ hai, bằng chứng đa quốc gia (P7) cho thấy chế độ thể chế ICRV không dịch chuyển điểm uốn một cách đơn điệu mà</w:t>
       </w:r>
       <w:r>
         <w:t xml:space="preserve"> </w:t>
@@ -24738,13 +24874,13 @@
           <w:bCs/>
           <w:b/>
         </w:rPr>
-        <w:t xml:space="preserve">dịch chuyển có hệ thống dọc theo gradient ICRV</w:t>
-      </w:r>
-      <w:r>
-        <w:t xml:space="preserve"> </w:t>
-      </w:r>
-      <w:r>
-        <w:t xml:space="preserve">— chính cơ chế địa hình của luận án. Thứ ba, tại các quốc đảo nhỏ Thái Bình Dương (P8), quan hệ I-P sụp thành âm đơn điệu, tức</w:t>
+        <w:t xml:space="preserve">chi phối độ cong (concavity / biên độ) của hình chữ U ngược</w:t>
+      </w:r>
+      <w:r>
+        <w:t xml:space="preserve"> </w:t>
+      </w:r>
+      <w:r>
+        <w:t xml:space="preserve">— độ cong sâu dần khi chất lượng thể chế suy giảm — chính cơ chế địa hình của luận án. Thứ ba, tại các quốc đảo nhỏ Thái Bình Dương (P8), quan hệ I-P sụp thành âm đơn điệu, tức</w:t>
       </w:r>
       <w:r>
         <w:t xml:space="preserve"> </w:t>
@@ -29320,7 +29456,7 @@
           <m:t>=</m:t>
         </m:r>
         <m:r>
-          <m:t>34</m:t>
+          <m:t>25</m:t>
         </m:r>
         <m:r>
           <m:rPr>
@@ -29329,7 +29465,7 @@
           <m:t>,</m:t>
         </m:r>
         <m:r>
-          <m:t>6</m:t>
+          <m:t>7</m:t>
         </m:r>
         <m:r>
           <m:rPr>
@@ -29374,7 +29510,7 @@
           <m:t>,</m:t>
         </m:r>
         <m:r>
-          <m:t>002</m:t>
+          <m:t>026</m:t>
         </m:r>
       </m:oMath>
       <w:r>
@@ -29416,7 +29552,7 @@
         <w:pStyle w:val="FirstParagraph"/>
       </w:pPr>
       <w:r>
-        <w:t xml:space="preserve">Kết quả quan trọng nhất của P7 là xác nhận dải biến thiên theo ICRV. Mô hình M10 cho hiệu ứng chính của nhóm ICRV (</w:t>
+        <w:t xml:space="preserve">Kết quả quan trọng nhất của P7 là xác nhận vai trò điều tiết của ICRV đối với hình dạng đường cong I-P. Mô hình M10 cho hiệu ứng chính của nhóm ICRV (</w:t>
       </w:r>
       <m:oMath>
         <m:r>
@@ -29474,7 +29610,7 @@
         </m:r>
       </m:oMath>
       <w:r>
-        <w:t xml:space="preserve">); hệ số dương này phản ánh việc doanh thu danh nghĩa trên lao động cao hơn ở các nền kinh tế có mặt bằng giá thấp, đặc trưng của nhóm cận biên và mới nổi, nên cần diễn giải thận trọng. Quan trọng hơn cho dải biến thiên là hai số hạng tương tác: FSTS×ICRV (</w:t>
+        <w:t xml:space="preserve">); hệ số dương này phản ánh việc doanh thu danh nghĩa trên lao động cao hơn ở các nền kinh tế có mặt bằng giá thấp, đặc trưng của nhóm cận biên và mới nổi, nên cần diễn giải thận trọng. Quan trọng hơn là hai số hạng tương tác có ý nghĩa: FSTS×ICRV (</w:t>
       </w:r>
       <m:oMath>
         <m:r>
@@ -29607,90 +29743,47 @@
         </m:r>
       </m:oMath>
       <w:r>
-        <w:t xml:space="preserve">). Hai hệ số này cho thấy điểm uốn tăng dần khi chuyển từ nhóm thể chế mạnh sang nhóm thể chế yếu:</w:t>
-      </w:r>
-    </w:p>
-    <w:p>
-      <w:pPr>
-        <w:pStyle w:val="BodyText"/>
-      </w:pPr>
-      <m:oMathPara>
-        <m:oMathParaPr>
-          <m:jc m:val="center"/>
-        </m:oMathParaPr>
-        <m:oMath>
-          <m:r>
-            <m:rPr>
-              <m:nor/>
-              <m:sty m:val="p"/>
-            </m:rPr>
-            <m:t>TP(Advanced đổi mới)</m:t>
-          </m:r>
-          <m:r>
-            <m:rPr>
-              <m:sty m:val="p"/>
-            </m:rPr>
-            <m:t>≈</m:t>
-          </m:r>
-          <m:r>
-            <m:t>28</m:t>
-          </m:r>
-          <m:r>
-            <m:rPr>
-              <m:sty m:val="p"/>
-            </m:rPr>
-            <m:t>%</m:t>
-          </m:r>
-          <m:r>
-            <m:rPr>
-              <m:sty m:val="p"/>
-            </m:rPr>
-            <m:t>&lt;</m:t>
-          </m:r>
-          <m:r>
-            <m:rPr>
-              <m:nor/>
-              <m:sty m:val="p"/>
-            </m:rPr>
-            <m:t>TP(Upper-middle)</m:t>
-          </m:r>
-          <m:r>
-            <m:rPr>
-              <m:sty m:val="p"/>
-            </m:rPr>
-            <m:t>&lt;</m:t>
-          </m:r>
-          <m:r>
-            <m:rPr>
-              <m:nor/>
-              <m:sty m:val="p"/>
-            </m:rPr>
-            <m:t>TP(Frontier/SIDS)</m:t>
-          </m:r>
-          <m:r>
-            <m:rPr>
-              <m:sty m:val="p"/>
-            </m:rPr>
-            <m:t>≈</m:t>
-          </m:r>
-          <m:r>
-            <m:t>55</m:t>
-          </m:r>
-          <m:r>
-            <m:rPr>
-              <m:sty m:val="p"/>
-            </m:rPr>
-            <m:t>%</m:t>
-          </m:r>
-        </m:oMath>
-      </m:oMathPara>
-    </w:p>
-    <w:p>
-      <w:pPr>
-        <w:pStyle w:val="FirstParagraph"/>
-      </w:pPr>
-      <w:r>
-        <w:t xml:space="preserve">Dải biến thiên này nhất quán với dự đoán của lý thuyết thể chế. Ở môi trường thể chế mạnh (Nhóm I), doanh nghiệp hoàn vốn chi phí quốc tế hóa ở mức FSTS thấp hơn, tức đạt đỉnh hiệu quả sớm hơn. Tại các nền kinh tế thể chế yếu (Nhóm V–VI), doanh nghiệp cần quốc tế hóa sâu hơn để bù đắp chi phí giao dịch và bất định thể chế, nên điểm uốn xuất hiện muộn hơn, ở mức FSTS cao hơn.</w:t>
+        <w:t xml:space="preserve">). Hai hệ số này cho thấy chế độ thể chế chi phối</w:t>
+      </w:r>
+      <w:r>
+        <w:t xml:space="preserve"> </w:t>
+      </w:r>
+      <w:r>
+        <w:rPr>
+          <w:bCs/>
+          <w:b/>
+        </w:rPr>
+        <w:t xml:space="preserve">độ cong (concavity / biên độ)</w:t>
+      </w:r>
+      <w:r>
+        <w:t xml:space="preserve"> </w:t>
+      </w:r>
+      <w:r>
+        <w:t xml:space="preserve">của hình chữ U ngược chứ không phải một gradient điểm uốn đơn điệu: độ cong sâu dần khi chất lượng thể chế suy giảm, làm hình phạt sau đỉnh gay gắt hơn ở các chế độ thể chế yếu (cận biên, SIDS), và phẳng dần về gần tuyến tính ở các chế độ tiên tiến.</w:t>
+      </w:r>
+    </w:p>
+    <w:p>
+      <w:pPr>
+        <w:pStyle w:val="BodyText"/>
+      </w:pPr>
+      <w:r>
+        <w:t xml:space="preserve">Điểm uốn theo nhóm là không đồng nhất, dao động trong dải rộng (khoảng 16–50% FSTS) và cụm quanh ~40%, nhưng</w:t>
+      </w:r>
+      <w:r>
+        <w:t xml:space="preserve"> </w:t>
+      </w:r>
+      <w:r>
+        <w:rPr>
+          <w:bCs/>
+          <w:b/>
+        </w:rPr>
+        <w:t xml:space="preserve">không</w:t>
+      </w:r>
+      <w:r>
+        <w:t xml:space="preserve"> </w:t>
+      </w:r>
+      <w:r>
+        <w:t xml:space="preserve">dịch chuyển đơn điệu theo chất lượng thể chế. Cơ chế vững được nhận diện là biên độ chứ không phải sự di chuyển vị trí điểm tối ưu: trong môi trường thể chế mạnh (Nhóm I), đường cong phẳng và gần tuyến tính nên tổn thất sau đỉnh nhỏ; tại các nền kinh tế thể chế yếu (Nhóm V–VI), đường cong cong sâu hơn nên hình phạt cho quốc tế hóa quá mức trở nên gay gắt hơn.</w:t>
       </w:r>
     </w:p>
     <w:p>
@@ -30763,7 +30856,7 @@
         </m:r>
       </m:oMath>
       <w:r>
-        <w:t xml:space="preserve">) đều nâng hiệu quả doanh nghiệp độc lập với FSTS. Hiệu ứng kinh nghiệm hàm ý năng suất cao hơn khoảng 0,7% trên mỗi năm kinh nghiệm trong ngành; hiệu ứng nhà quản trị nữ hàm ý lợi thế năng suất khoảng 20% (</w:t>
+        <w:t xml:space="preserve">) đều nâng mặt bằng hiệu quả doanh nghiệp độc lập với FSTS. Hiệu ứng kinh nghiệm hàm ý năng suất cao hơn khoảng 0,7% trên mỗi năm kinh nghiệm trong ngành; hiệu ứng nhà quản trị nữ hàm ý lợi thế năng suất khoảng 20% (</w:t>
       </w:r>
       <m:oMath>
         <m:r>
@@ -30823,7 +30916,7 @@
         </m:r>
       </m:oMath>
       <w:r>
-        <w:t xml:space="preserve">). Tương tác FSTS×kinh nghiệm không có ý nghĩa trong M9 (</w:t>
+        <w:t xml:space="preserve">). Các đặc điểm này được đưa vào như nhóm biến kiểm soát quản trị nội sinh chứ không phải nhân tố điều tiết trọng tâm: chúng tác động ở dạng hiệu ứng mức (level effect) nâng mặt bằng năng suất, không định hình độ cong của đường quan hệ I-P. Số hạng tương tác FSTS×kinh nghiệm chỉ là chẩn đoán phụ trợ, không có ý nghĩa trong M9 (</w:t>
       </w:r>
       <m:oMath>
         <m:r>
@@ -30881,13 +30974,45 @@
         </m:r>
       </m:oMath>
       <w:r>
-        <w:t xml:space="preserve">) nhưng đạt</w:t>
-      </w:r>
-      <w:r>
-        <w:t xml:space="preserve"> </w:t>
+        <w:t xml:space="preserve">) và chỉ cận ngưỡng trong M11 (</w:t>
       </w:r>
       <m:oMath>
         <m:r>
+          <m:t>β</m:t>
+        </m:r>
+        <m:r>
+          <m:rPr>
+            <m:sty m:val="p"/>
+          </m:rPr>
+          <m:t>=</m:t>
+        </m:r>
+        <m:r>
+          <m:rPr>
+            <m:sty m:val="p"/>
+          </m:rPr>
+          <m:t>−</m:t>
+        </m:r>
+        <m:r>
+          <m:t>0</m:t>
+        </m:r>
+        <m:r>
+          <m:rPr>
+            <m:sty m:val="p"/>
+          </m:rPr>
+          <m:t>,</m:t>
+        </m:r>
+        <m:r>
+          <m:t>019</m:t>
+        </m:r>
+      </m:oMath>
+      <w:r>
+        <w:t xml:space="preserve">,</w:t>
+      </w:r>
+      <w:r>
+        <w:t xml:space="preserve"> </w:t>
+      </w:r>
+      <m:oMath>
+        <m:r>
           <m:t>p</m:t>
         </m:r>
         <m:r>
@@ -30907,42 +31032,7 @@
         </m:r>
       </m:oMath>
       <w:r>
-        <w:t xml:space="preserve"> </w:t>
-      </w:r>
-      <w:r>
-        <w:t xml:space="preserve">trong M11 (</w:t>
-      </w:r>
-      <m:oMath>
-        <m:r>
-          <m:t>β</m:t>
-        </m:r>
-        <m:r>
-          <m:rPr>
-            <m:sty m:val="p"/>
-          </m:rPr>
-          <m:t>=</m:t>
-        </m:r>
-        <m:r>
-          <m:rPr>
-            <m:sty m:val="p"/>
-          </m:rPr>
-          <m:t>−</m:t>
-        </m:r>
-        <m:r>
-          <m:t>0</m:t>
-        </m:r>
-        <m:r>
-          <m:rPr>
-            <m:sty m:val="p"/>
-          </m:rPr>
-          <m:t>,</m:t>
-        </m:r>
-        <m:r>
-          <m:t>019</m:t>
-        </m:r>
-      </m:oMath>
-      <w:r>
-        <w:t xml:space="preserve">), gợi ý rằng trong đặc tả đầy đủ, nhà quản trị nhiều kinh nghiệm xử lý thách thức phối hợp ở mức FSTS cao tốt hơn. H4 do đó được xác nhận một phần ở dạng hiệu ứng nâng mặt bằng, còn vai trò uốn đường cong chỉ xuất hiện cận biên và cần tái kiểm chứng.</w:t>
+        <w:t xml:space="preserve">); do đó không cấu thành bằng chứng điều tiết trọng tâm. Việc kiểm soát chất lượng quản trị theo lý thuyết Bậc trên khóa chặt thiên lệch nội sinh và bảo vệ tính nhân quả thuần khiết của tương tác Thể chế × Công nghệ; ký hiệu H4 được giữ nguyên để tương thích với các bản thảo đồng hành (P3/P4/P5).</w:t>
       </w:r>
     </w:p>
     <w:p>
@@ -35736,43 +35826,63 @@
         <w:pStyle w:val="FirstParagraph"/>
       </w:pPr>
       <w:r>
-        <w:t xml:space="preserve">Tổng hợp bằng chứng từ phân tích tổng hợp (P6) và toàn mẫu sơ cấp (P7), cùng ba nghiên cứu đơn quốc gia, dẫn đến luận điểm trung tâm: hình dạng của quan hệ I-P mang tính phổ quát, nhưng điểm tối ưu của nó được dịch chuyển theo bối cảnh thể chế. Đường cong U ngược tồn tại nhất quán qua các bối cảnh có thể chế đủ mạnh, nhưng điểm uốn không phải là một tham số cấu trúc cố định. Nó di chuyển theo chất lượng thể chế: từ đỉnh sớm ở chế độ tiên tiến đến đỉnh muộn ở chế độ cận biên và dễ tổn thương.</w:t>
-      </w:r>
-    </w:p>
-    <w:p>
-      <w:pPr>
-        <w:pStyle w:val="BodyText"/>
-      </w:pPr>
-      <w:r>
-        <w:t xml:space="preserve">Bằng chứng định lượng về dải dịch chuyển này khá rõ ràng. Điểm uốn đi từ khoảng 82% FSTS tại Singapore (Nhóm I, tiên tiến đổi mới) xuống khoảng 48,78% tại Trung Quốc (Nhóm III, thu nhập trung bình cao) rồi xuống 39,7% tại Việt Nam (Nhóm IV, chuyển đổi thu nhập trung bình thấp), và toàn mẫu P7 xác nhận dải biến thiên Advanced (</w:t>
-      </w:r>
-      <m:oMath>
-        <m:r>
-          <m:rPr>
-            <m:sty m:val="p"/>
-          </m:rPr>
-          <m:t>≈</m:t>
-        </m:r>
-      </m:oMath>
-      <w:r>
-        <w:t xml:space="preserve"> </w:t>
-      </w:r>
-      <w:r>
-        <w:t xml:space="preserve">28%) thấp hơn Frontier/SIDS (</w:t>
-      </w:r>
-      <m:oMath>
-        <m:r>
-          <m:rPr>
-            <m:sty m:val="p"/>
-          </m:rPr>
-          <m:t>≈</m:t>
-        </m:r>
-      </m:oMath>
-      <w:r>
-        <w:t xml:space="preserve"> </w:t>
-      </w:r>
-      <w:r>
-        <w:t xml:space="preserve">55%). Như vậy, sự dịch chuyển điểm tối ưu hòa giải mâu thuẫn bề ngoài giữa các nghiên cứu báo cáo quan hệ tuyến tính dương, U ngược, và không có ý nghĩa: đó là những quan sát về cùng một họ đường cong được lấy mẫu ở các địa điểm thể chế khác nhau. Phát hiện này vượt qua các công trình nền tảng của Lu và Beamish (2004), vốn tìm thấy một điểm uốn cố định khoảng 60% trên doanh nghiệp Nhật Bản, bằng cách chứng minh rằng không tồn tại một điểm uốn phổ quát cho mọi bối cảnh, và mở rộng phát hiện điều tiết thể chế của Marano và cộng sự (2016) từ phân loại nhị phân sang sáu chế độ con ICRV.</w:t>
+        <w:t xml:space="preserve">Tổng hợp bằng chứng từ phân tích tổng hợp (P6) và toàn mẫu sơ cấp (P7), cùng ba nghiên cứu đơn quốc gia, dẫn đến luận điểm trung tâm: hình dạng của quan hệ I-P mang tính phổ quát, nhưng độ cong và vị trí điểm tối ưu của nó phụ thuộc vào bối cảnh thể chế. Đường cong U ngược tồn tại nhất quán qua các bối cảnh có thể chế đủ mạnh, nhưng độ cong của nó không phải là một tham số cấu trúc cố định. Chế độ thể chế chi phối</w:t>
+      </w:r>
+      <w:r>
+        <w:t xml:space="preserve"> </w:t>
+      </w:r>
+      <w:r>
+        <w:rPr>
+          <w:bCs/>
+          <w:b/>
+        </w:rPr>
+        <w:t xml:space="preserve">độ cong (concavity / biên độ)</w:t>
+      </w:r>
+      <w:r>
+        <w:t xml:space="preserve"> </w:t>
+      </w:r>
+      <w:r>
+        <w:t xml:space="preserve">của hình chữ U ngược chứ không phải một gradient điểm uốn đơn điệu: độ cong sâu dần khi chất lượng thể chế suy giảm, làm hình phạt sau đỉnh gay gắt hơn ở chế độ cận biên và dễ tổn thương, và phẳng dần về gần tuyến tính ở chế độ tiên tiến.</w:t>
+      </w:r>
+    </w:p>
+    <w:p>
+      <w:pPr>
+        <w:pStyle w:val="BodyText"/>
+      </w:pPr>
+      <w:r>
+        <w:t xml:space="preserve">Bằng chứng định lượng về tính phụ thuộc bối cảnh này khá rõ ràng. Trên ba nghiên cứu đơn quốc gia, điểm uốn đi từ khoảng 82% FSTS tại Singapore (Nhóm I, tiên tiến đổi mới) xuống khoảng 48,78% tại Trung Quốc (Nhóm III, thu nhập trung bình cao) rồi xuống 39,7% tại Việt Nam (Nhóm IV, chuyển đổi thu nhập trung bình thấp). Trong toàn mẫu P7, điểm uốn theo nhóm là không đồng nhất (dao động trong dải khoảng 16–50% FSTS), cụm quanh ~40% và</w:t>
+      </w:r>
+      <w:r>
+        <w:t xml:space="preserve"> </w:t>
+      </w:r>
+      <w:r>
+        <w:rPr>
+          <w:bCs/>
+          <w:b/>
+        </w:rPr>
+        <w:t xml:space="preserve">không</w:t>
+      </w:r>
+      <w:r>
+        <w:t xml:space="preserve"> </w:t>
+      </w:r>
+      <w:r>
+        <w:t xml:space="preserve">dịch chuyển đơn điệu theo chất lượng thể chế; điều dịch chuyển có hệ thống là</w:t>
+      </w:r>
+      <w:r>
+        <w:t xml:space="preserve"> </w:t>
+      </w:r>
+      <w:r>
+        <w:rPr>
+          <w:bCs/>
+          <w:b/>
+        </w:rPr>
+        <w:t xml:space="preserve">độ cong (concavity / biên độ)</w:t>
+      </w:r>
+      <w:r>
+        <w:t xml:space="preserve"> </w:t>
+      </w:r>
+      <w:r>
+        <w:t xml:space="preserve">của hình chữ U ngược, sâu dần khi thể chế suy giảm và phẳng dần về gần tuyến tính ở chế độ tiên tiến. Như vậy, tính không đồng nhất của độ cong và vị trí điểm tối ưu hòa giải mâu thuẫn bề ngoài giữa các nghiên cứu báo cáo quan hệ tuyến tính dương, U ngược, và không có ý nghĩa: đó là những quan sát về cùng một họ đường cong được lấy mẫu ở các địa điểm thể chế khác nhau. Phát hiện này vượt qua các công trình nền tảng của Lu và Beamish (2004), vốn tìm thấy một điểm uốn cố định khoảng 60% trên doanh nghiệp Nhật Bản, bằng cách chứng minh rằng không tồn tại một điểm uốn phổ quát cho mọi bối cảnh, và mở rộng phát hiện điều tiết thể chế của Marano và cộng sự (2016) từ phân loại nhị phân sang sáu chế độ con ICRV.</w:t>
       </w:r>
     </w:p>
     <w:bookmarkEnd w:id="130"/>
@@ -36304,31 +36414,31 @@
               <w:jc w:val="left"/>
             </w:pPr>
             <w:r>
-              <w:t xml:space="preserve">H4 (Nhà quản trị điều tiết)</w:t>
-            </w:r>
-          </w:p>
-        </w:tc>
-        <w:tc>
-          <w:tcPr/>
-          <w:p>
-            <w:pPr>
-              <w:pStyle w:val="Compact"/>
-              <w:jc w:val="left"/>
-            </w:pPr>
-            <w:r>
-              <w:t xml:space="preserve">Kinh nghiệm và giới tính nhà quản trị</w:t>
-            </w:r>
-          </w:p>
-        </w:tc>
-        <w:tc>
-          <w:tcPr/>
-          <w:p>
-            <w:pPr>
-              <w:pStyle w:val="Compact"/>
-              <w:jc w:val="left"/>
-            </w:pPr>
-            <w:r>
-              <w:t xml:space="preserve">Hỗn hợp: trong P7, nhà quản trị nữ</w:t>
+              <w:t xml:space="preserve">H4 (kiểm soát quản trị nội sinh)</w:t>
+            </w:r>
+          </w:p>
+        </w:tc>
+        <w:tc>
+          <w:tcPr/>
+          <w:p>
+            <w:pPr>
+              <w:pStyle w:val="Compact"/>
+              <w:jc w:val="left"/>
+            </w:pPr>
+            <w:r>
+              <w:t xml:space="preserve">Kinh nghiệm và giới tính nhà quản trị nâng mặt bằng (kiểm soát, không điều tiết độ cong)</w:t>
+            </w:r>
+          </w:p>
+        </w:tc>
+        <w:tc>
+          <w:tcPr/>
+          <w:p>
+            <w:pPr>
+              <w:pStyle w:val="Compact"/>
+              <w:jc w:val="left"/>
+            </w:pPr>
+            <w:r>
+              <w:t xml:space="preserve">Hiệu ứng mức trong P7: nhà quản trị nữ</w:t>
             </w:r>
             <w:r>
               <w:t xml:space="preserve"> </w:t>
@@ -36363,11 +36473,40 @@
               </m:r>
             </m:oMath>
             <w:r>
-              <w:t xml:space="preserve">; tương tác kinh nghiệm cận ngưỡng (</w:t>
+              <w:t xml:space="preserve"> </w:t>
+            </w:r>
+            <w:r>
+              <w:t xml:space="preserve">(</w:t>
             </w:r>
             <m:oMath>
               <m:r>
                 <m:t>p</m:t>
+              </m:r>
+              <m:r>
+                <m:rPr>
+                  <m:sty m:val="p"/>
+                </m:rPr>
+                <m:t>&lt;</m:t>
+              </m:r>
+              <m:r>
+                <m:rPr>
+                  <m:sty m:val="p"/>
+                </m:rPr>
+                <m:t>,</m:t>
+              </m:r>
+              <m:r>
+                <m:t>001</m:t>
+              </m:r>
+            </m:oMath>
+            <w:r>
+              <w:t xml:space="preserve">), kinh nghiệm</w:t>
+            </w:r>
+            <w:r>
+              <w:t xml:space="preserve"> </w:t>
+            </w:r>
+            <m:oMath>
+              <m:r>
+                <m:t>β</m:t>
               </m:r>
               <m:r>
                 <m:rPr>
@@ -36379,9 +36518,67 @@
                 <m:rPr>
                   <m:sty m:val="p"/>
                 </m:rPr>
+                <m:t>+</m:t>
+              </m:r>
+              <m:r>
+                <m:t>0</m:t>
+              </m:r>
+              <m:r>
+                <m:rPr>
+                  <m:sty m:val="p"/>
+                </m:rPr>
                 <m:t>,</m:t>
               </m:r>
               <m:r>
+                <m:t>007</m:t>
+              </m:r>
+            </m:oMath>
+            <w:r>
+              <w:t xml:space="preserve"> </w:t>
+            </w:r>
+            <w:r>
+              <w:t xml:space="preserve">(</w:t>
+            </w:r>
+            <m:oMath>
+              <m:r>
+                <m:t>p</m:t>
+              </m:r>
+              <m:r>
+                <m:rPr>
+                  <m:sty m:val="p"/>
+                </m:rPr>
+                <m:t>=</m:t>
+              </m:r>
+              <m:r>
+                <m:rPr>
+                  <m:sty m:val="p"/>
+                </m:rPr>
+                <m:t>,</m:t>
+              </m:r>
+              <m:r>
+                <m:t>026</m:t>
+              </m:r>
+            </m:oMath>
+            <w:r>
+              <w:t xml:space="preserve">); tương tác FSTS×kinh nghiệm chỉ cận ngưỡng (</w:t>
+            </w:r>
+            <m:oMath>
+              <m:r>
+                <m:t>p</m:t>
+              </m:r>
+              <m:r>
+                <m:rPr>
+                  <m:sty m:val="p"/>
+                </m:rPr>
+                <m:t>=</m:t>
+              </m:r>
+              <m:r>
+                <m:rPr>
+                  <m:sty m:val="p"/>
+                </m:rPr>
+                <m:t>,</m:t>
+              </m:r>
+              <m:r>
                 <m:t>053</m:t>
               </m:r>
             </m:oMath>
@@ -36389,7 +36586,7 @@
               <w:t xml:space="preserve"> </w:t>
             </w:r>
             <w:r>
-              <w:t xml:space="preserve">tại M11)</w:t>
+              <w:t xml:space="preserve">tại M11), là chẩn đoán phụ trợ chứ không phải điều tiết trọng tâm</w:t>
             </w:r>
           </w:p>
         </w:tc>
@@ -36514,41 +36711,120 @@
               </m:r>
             </m:oMath>
             <w:r>
-              <w:t xml:space="preserve">) từ P6 và dải biến thiên điểm uốn từ P7 (Advanced</w:t>
+              <w:t xml:space="preserve">) từ P6 và tương tác M10 từ P7 (FSTS×ICRV</w:t>
             </w:r>
             <w:r>
               <w:t xml:space="preserve"> </w:t>
             </w:r>
             <m:oMath>
+              <m:r>
+                <m:t>β</m:t>
+              </m:r>
               <m:r>
                 <m:rPr>
                   <m:sty m:val="p"/>
                 </m:rPr>
-                <m:t>≈</m:t>
-              </m:r>
-            </m:oMath>
-            <w:r>
-              <w:t xml:space="preserve"> </w:t>
-            </w:r>
-            <w:r>
-              <w:t xml:space="preserve">28% &lt; Frontier/SIDS</w:t>
-            </w:r>
-            <w:r>
-              <w:t xml:space="preserve"> </w:t>
-            </w:r>
-            <m:oMath>
+                <m:t>=</m:t>
+              </m:r>
               <m:r>
                 <m:rPr>
                   <m:sty m:val="p"/>
                 </m:rPr>
-                <m:t>≈</m:t>
+                <m:t>+</m:t>
+              </m:r>
+              <m:r>
+                <m:t>1</m:t>
+              </m:r>
+              <m:r>
+                <m:rPr>
+                  <m:sty m:val="p"/>
+                </m:rPr>
+                <m:t>,</m:t>
+              </m:r>
+              <m:r>
+                <m:t>85</m:t>
               </m:r>
             </m:oMath>
             <w:r>
+              <w:t xml:space="preserve">; FSTS</w:t>
+            </w:r>
+            <m:oMath>
+              <m:sSup>
+                <m:e>
+                  <m:r>
+                    <m:t>​</m:t>
+                  </m:r>
+                </m:e>
+                <m:sup>
+                  <m:r>
+                    <m:t>2</m:t>
+                  </m:r>
+                </m:sup>
+              </m:sSup>
+            </m:oMath>
+            <w:r>
+              <w:t xml:space="preserve">×ICRV</w:t>
+            </w:r>
+            <w:r>
               <w:t xml:space="preserve"> </w:t>
             </w:r>
-            <w:r>
-              <w:t xml:space="preserve">55%)</w:t>
+            <m:oMath>
+              <m:r>
+                <m:t>β</m:t>
+              </m:r>
+              <m:r>
+                <m:rPr>
+                  <m:sty m:val="p"/>
+                </m:rPr>
+                <m:t>=</m:t>
+              </m:r>
+              <m:r>
+                <m:rPr>
+                  <m:sty m:val="p"/>
+                </m:rPr>
+                <m:t>−</m:t>
+              </m:r>
+              <m:r>
+                <m:t>2</m:t>
+              </m:r>
+              <m:r>
+                <m:rPr>
+                  <m:sty m:val="p"/>
+                </m:rPr>
+                <m:t>,</m:t>
+              </m:r>
+              <m:r>
+                <m:t>93</m:t>
+              </m:r>
+            </m:oMath>
+            <w:r>
+              <w:t xml:space="preserve">; đều</w:t>
+            </w:r>
+            <w:r>
+              <w:t xml:space="preserve"> </w:t>
+            </w:r>
+            <m:oMath>
+              <m:r>
+                <m:t>p</m:t>
+              </m:r>
+              <m:r>
+                <m:rPr>
+                  <m:sty m:val="p"/>
+                </m:rPr>
+                <m:t>&lt;</m:t>
+              </m:r>
+              <m:r>
+                <m:rPr>
+                  <m:sty m:val="p"/>
+                </m:rPr>
+                <m:t>,</m:t>
+              </m:r>
+              <m:r>
+                <m:t>001</m:t>
+              </m:r>
+            </m:oMath>
+            <w:r>
+              <w:t xml:space="preserve">); cơ chế là độ cong/biên độ (sâu dần khi thể chế suy giảm), không phải dịch chuyển điểm uốn đơn điệu</w:t>
             </w:r>
           </w:p>
         </w:tc>
@@ -37138,7 +37414,7 @@
           <m:t>=</m:t>
         </m:r>
         <m:r>
-          <m:t>34</m:t>
+          <m:t>25</m:t>
         </m:r>
         <m:r>
           <m:rPr>
@@ -37147,7 +37423,7 @@
           <m:t>,</m:t>
         </m:r>
         <m:r>
-          <m:t>6</m:t>
+          <m:t>7</m:t>
         </m:r>
         <m:r>
           <m:rPr>
@@ -37192,7 +37468,7 @@
           <m:t>,</m:t>
         </m:r>
         <m:r>
-          <m:t>002</m:t>
+          <m:t>026</m:t>
         </m:r>
       </m:oMath>
       <w:r>
@@ -38287,13 +38563,13 @@
       </w:r>
     </w:p>
     <w:bookmarkEnd w:id="141"/>
-    <w:bookmarkStart w:id="142" w:name="Xbce3792f42f8794cec523698a3d6f54cb810e39"/>
+    <w:bookmarkStart w:id="142" w:name="Xece9a1da6f346a507472622c3a51811b77b548d"/>
     <w:p>
       <w:pPr>
         <w:pStyle w:val="Heading3"/>
       </w:pPr>
       <w:r>
-        <w:t xml:space="preserve">5.1.4 Đặc điểm nhà quản trị là yếu tố điều tiết cá nhân, hỗ trợ có điều kiện H4</w:t>
+        <w:t xml:space="preserve">5.1.4 Đặc điểm nhà quản trị là kiểm soát quản trị nội sinh, hỗ trợ có điều kiện H4</w:t>
       </w:r>
     </w:p>
     <w:p>
@@ -38301,7 +38577,7 @@
         <w:pStyle w:val="FirstParagraph"/>
       </w:pPr>
       <w:r>
-        <w:t xml:space="preserve">Kết quả về H4 từ P7 cho thấy đặc điểm nhà quản trị cấp cao tác động điều tiết không đồng nhất. Giới tính nữ của nhà quản trị (</w:t>
+        <w:t xml:space="preserve">Kết quả về H4 từ P7 cho thấy đặc điểm nhà quản trị cấp cao tác động ở dạng hiệu ứng mức (level effect). Giới tính nữ của nhà quản trị (</w:t>
       </w:r>
       <m:oMath>
         <m:acc>
@@ -38366,23 +38642,23 @@
         </m:r>
       </m:oMath>
       <w:r>
-        <w:t xml:space="preserve">) nhất quán mang hiệu ứng tích cực lên hiệu quả I-P trong toàn mẫu: doanh nghiệp có nhà quản trị cấp cao là nữ đạt hiệu quả cao hơn từ quốc tế hóa. Điều này phù hợp với lý thuyết thượng tầng quản trị (Hambrick &amp; Mason, 1984), theo đó đặc điểm của cấp lãnh đạo định hình cách tổ chức nhận diện và khai thác cơ hội quốc tế.</w:t>
-      </w:r>
-    </w:p>
-    <w:p>
-      <w:pPr>
-        <w:pStyle w:val="BodyText"/>
-      </w:pPr>
-      <w:r>
-        <w:t xml:space="preserve">Cơ chế lý thuyết có thể đi qua hai kênh. Một là tính đa dạng nhận thức: nhà quản trị nữ thường mang lại góc nhìn khác biệt khi ra quyết định quốc tế hóa, giúp nhận diện thị trường ngách và giảm rủi ro tập trung. Hai là chuẩn mực quản trị: sự hiện diện của lãnh đạo nữ tương quan với thực hành quản trị tốt hơn và minh bạch hơn, điều đặc biệt quan trọng trong môi trường thể chế yếu.</w:t>
-      </w:r>
-    </w:p>
-    <w:p>
-      <w:pPr>
-        <w:pStyle w:val="BodyText"/>
-      </w:pPr>
-      <w:r>
-        <w:t xml:space="preserve">Dù vậy, cần lưu ý rằng tác động này được phát hiện ở cấp gộp toàn mẫu (P7), nên còn phải kiểm định riêng theo từng bối cảnh ICRV mới hiểu đầy đủ điều kiện biên của yếu tố điều tiết cấp quản trị. Kết quả không có ý nghĩa về kinh nghiệm nhà quản trị gợi ý rằng, trong bối cảnh châu Á đa dạng, số năm kinh nghiệm đơn thuần chưa nắm bắt được</w:t>
+        <w:t xml:space="preserve">) nhất quán nâng mặt bằng hiệu quả I-P trong toàn mẫu: doanh nghiệp có nhà quản trị cấp cao là nữ đạt hiệu quả cao hơn từ quốc tế hóa. Điều này phù hợp với lý thuyết thượng tầng quản trị (Hambrick &amp; Mason, 1984), theo đó đặc điểm của cấp lãnh đạo định hình cách tổ chức nhận diện và khai thác cơ hội quốc tế. Tuy vậy, các đặc điểm này được đưa vào khung như khối kiểm soát quản trị nội sinh chứ không phải nhân tố điều tiết trọng tâm định hình độ cong của đường quan hệ I-P. Để bảo vệ tính nhân quả thuần khiết của tương tác Thể chế × Công nghệ, các đặc điểm nhà quản trị (kinh nghiệm, học vấn, giới tính) được đưa vào như biến kiểm soát quản trị nội sinh, không phải nhân tố điều tiết trọng tâm của đường cong I-P; ký hiệu H4 được giữ nguyên để tương thích với các bản thảo đồng hành (P3/P4/P5).</w:t>
+      </w:r>
+    </w:p>
+    <w:p>
+      <w:pPr>
+        <w:pStyle w:val="BodyText"/>
+      </w:pPr>
+      <w:r>
+        <w:t xml:space="preserve">Cơ chế lý thuyết có thể đi qua hai kênh. Một là tính đa dạng nhận thức: nhà quản trị nữ thường mang lại góc nhìn khác biệt khi ra quyết định quốc tế hóa, giúp nhận diện thị trường ngách và giảm rủi ro tập trung. Hai là chuẩn mực quản trị: sự hiện diện của lãnh đạo nữ tương quan với thực hành quản trị tốt hơn và minh bạch hơn, điều đặc biệt quan trọng trong môi trường thể chế yếu. Việc kiểm soát các kênh này khóa chặt thiên lệch nội sinh phát sinh từ năng lực và sự đa dạng giới của nhà quản trị.</w:t>
+      </w:r>
+    </w:p>
+    <w:p>
+      <w:pPr>
+        <w:pStyle w:val="BodyText"/>
+      </w:pPr>
+      <w:r>
+        <w:t xml:space="preserve">Dù vậy, cần lưu ý rằng hiệu ứng mức này được phát hiện ở cấp gộp toàn mẫu (P7); việc tách riêng và kiểm định khả năng điều tiết theo từng bối cảnh ICRV thuộc về hướng nghiên cứu tương lai. Kết quả không có ý nghĩa về kinh nghiệm nhà quản trị gợi ý rằng, trong bối cảnh châu Á đa dạng, số năm kinh nghiệm đơn thuần chưa nắm bắt được</w:t>
       </w:r>
       <w:r>
         <w:t xml:space="preserve"> </w:t>
@@ -39242,7 +39518,7 @@
         <w:t xml:space="preserve">có giá trị dự đoán</w:t>
       </w:r>
       <w:r>
-        <w:t xml:space="preserve">: điểm uốn của quan hệ I-P giảm đơn điệu theo chiều từ đảo nhỏ và cận biên (~55%) xuống tiên tiến dẫn dắt bằng đổi mới (~28%). Thể chế càng mạnh, doanh nghiệp càng đạt đỉnh hiệu quả ở mức quốc tế hóa thấp hơn, đúng như giá trị dự đoán của phân loại.</w:t>
+        <w:t xml:space="preserve">: độ cong (concavity / biên độ) của quan hệ I-P sâu dần khi chất lượng thể chế suy giảm, từ gần tuyến tính ở chế độ tiên tiến dẫn dắt bằng đổi mới đến hình chữ U ngược rõ nét với hình phạt sau đỉnh gay gắt ở chế độ cận biên và đảo nhỏ, trong khi điểm uốn theo nhóm không đồng nhất và không dịch chuyển đơn điệu. Thể chế càng yếu, hình phạt cho quốc tế hóa quá mức càng gay gắt, đúng như giá trị dự đoán của phân loại.</w:t>
       </w:r>
     </w:p>
     <w:p>
@@ -39706,7 +39982,7 @@
         <w:pStyle w:val="BodyText"/>
       </w:pPr>
       <w:r>
-        <w:t xml:space="preserve">Sau cùng, cần kiểm định vai trò của đặc điểm nhà quản trị cấp cao (H4, gồm kinh nghiệm và giới tính) trong từng bối cảnh ICRV riêng, nhất là ở nhóm cận biên và đảo nhỏ, nơi tầng năng lực và thể chế đều yếu hơn, để xem liệu đặc điểm nhà quản trị có bù đắp được phần nào cho những thiếu hụt ấy hay không.</w:t>
+        <w:t xml:space="preserve">Sau cùng, trong luận án này đặc điểm nhà quản trị cấp cao (H4, gồm kinh nghiệm, học vấn và giới tính) được đưa vào như khối kiểm soát quản trị nội sinh chứ không phải nhân tố điều tiết trọng tâm; một hướng nghiên cứu tương lai là tách riêng và kiểm định khả năng điều tiết theo bối cảnh của các đặc điểm này trong từng chế độ ICRV, nhất là ở nhóm cận biên và đảo nhỏ, nơi tầng năng lực và thể chế đều yếu hơn, để xem liệu chất lượng quản trị có bù đắp được phần nào cho những thiếu hụt ấy hay không.</w:t>
       </w:r>
     </w:p>
     <w:p>
@@ -40462,7 +40738,7 @@
         <w:t xml:space="preserve">họ đường cong phụ thuộc bối cảnh</w:t>
       </w:r>
       <w:r>
-        <w:t xml:space="preserve">, trong đó điểm uốn là một hàm số giảm dần của chất lượng thể chế theo ICRV: thể chế càng mạnh, điểm uốn càng đến sớm, tức ở mức FSTS thấp hơn.</w:t>
+        <w:t xml:space="preserve">, trong đó độ cong (concavity / biên độ) là một hàm số tăng dần theo mức độ suy giảm của chất lượng thể chế theo ICRV: thể chế càng yếu, hình chữ U ngược càng cong sâu và hình phạt sau đỉnh càng gay gắt, trong khi điểm uốn theo nhóm không đồng nhất và không dịch chuyển đơn điệu.</w:t>
       </w:r>
     </w:p>
     <w:bookmarkEnd w:id="164"/>

</xml_diff>

<commit_message>
build: rebuild DOCX/PDF after NotebookLM peer-review revisions
Regenerates dist/downloads (chapters, CĐ2, manuscripts) + LUAN_AN_FULL +
luan_an_ctu after the FIP-elevation, DAI-threshold reframe, and Mekong Delta
policy concretization. Verified: CĐ2 carries the scale-vs-survival FIP pole,
Ch.5 carries the ASC/BAP + blockchain roadmap and hygiene-factor framing,
LUAN_AN_FULL carries FIP + 'kéo dài đỉnh chữ U'.

https://claude.ai/code/session_01TNqoRFY1vAVQL6GWg8X9M3
</commit_message>
<xml_diff>
--- a/dist/downloads/LUAN_AN_FULL_vi.docx
+++ b/dist/downloads/LUAN_AN_FULL_vi.docx
@@ -1581,6 +1581,62 @@
       </w:pPr>
       <w:r>
         <w:t xml:space="preserve">Cùng một mức cường độ xuất khẩu có thể nâng một doanh nghiệp ở nền kinh tế thể chế mạnh lên đỉnh năng suất, nhưng lại đẩy một doanh nghiệp ở quốc đảo nhỏ Thái Bình Dương vào vòng suy giảm đơn điệu. Chính nghịch lý đó, cùng một hành vi quốc tế hóa nhưng cho hai kết cục trái ngược tùy chế độ thể chế, là điểm khởi đầu của luận án này. Quốc tế hóa doanh nghiệp đã là một trong những chủ đề trung tâm của kinh doanh quốc tế (international business) suốt hơn nửa thế kỷ qua. Kể từ khi Johanson và Vahlne (1977) đề xuất mô hình Uppsala về quá trình quốc tế hóa tuần tự, gần nửa thế kỷ nghiên cứu đã tích lũy quanh một câu hỏi cốt lõi mà đến nay vẫn chưa có lời đáp dứt khoát: quốc tế hóa có thực sự cải thiện hiệu quả hoạt động của doanh nghiệp hay không, và nếu có thì trong những điều kiện nào? Lu và Beamish (2004) cung cấp bằng chứng then chốt về quan hệ hình chữ S giữa mức độ quốc tế hóa và hiệu quả, còn Contractor et al. (2003) cùng nhiều nghiên cứu kế tiếp tiếp tục thách thức, bổ sung và điều chỉnh kết luận đó. Điều đáng chú ý không phải là sự thiếu vắng bằng chứng. Vấn đề nằm ở sự phân tán của nó. Mối quan hệ giữa quốc tế hóa và hiệu quả hoạt động kinh doanh (internationalization-performance, I-P) là có thực, nhưng phức tạp và phụ thuộc vào nhiều điều kiện biên. Chính tính điều kiện này, chứ không phải bản thân dấu của hiệu ứng, mới là vấn đề lý thuyết cần được giải quyết.</w:t>
+      </w:r>
+    </w:p>
+    <w:p>
+      <w:pPr>
+        <w:pStyle w:val="BodyText"/>
+      </w:pPr>
+      <w:r>
+        <w:t xml:space="preserve">Luận án lập luận rằng sự phân tán ấy không phải là nhiễu thống kê, mà là dấu vết của hai chế độ quốc tế hóa khác nhau về bản chất, cùng tồn tại trong một khu vực. Ở một cực là</w:t>
+      </w:r>
+      <w:r>
+        <w:t xml:space="preserve"> </w:t>
+      </w:r>
+      <w:r>
+        <w:rPr>
+          <w:bCs/>
+          <w:b/>
+        </w:rPr>
+        <w:t xml:space="preserve">quốc tế hóa để mở rộng quy mô</w:t>
+      </w:r>
+      <w:r>
+        <w:t xml:space="preserve"> </w:t>
+      </w:r>
+      <w:r>
+        <w:t xml:space="preserve">(internationalization-to-scale): tại các nền kinh tế thể chế mạnh như Singapore, xuất khẩu là công cụ tối ưu hóa biên lợi nhuận, và đường cong hiệu quả gần như đơn điệu dương với điểm uốn rất muộn, vào khoảng 82% cường độ xuất khẩu, nghĩa là càng xuất khẩu càng có lãi. Ở cực đối lập là</w:t>
+      </w:r>
+      <w:r>
+        <w:t xml:space="preserve"> </w:t>
+      </w:r>
+      <w:r>
+        <w:rPr>
+          <w:bCs/>
+          <w:b/>
+        </w:rPr>
+        <w:t xml:space="preserve">quốc tế hóa để sinh tồn</w:t>
+      </w:r>
+      <w:r>
+        <w:t xml:space="preserve"> </w:t>
+      </w:r>
+      <w:r>
+        <w:t xml:space="preserve">(internationalization-to-survive): tại các quốc đảo nhỏ Thái Bình Dương, nơi thị trường nội địa quá nhỏ và chi phí hậu cần khổng lồ bào mòn lợi nhuận, doanh nghiệp buộc phải xuất khẩu bất kể điều kiện; trong số 187 doanh nghiệp có xuất khẩu trên toàn mẫu các quốc đảo nhỏ đang phát triển (SIDS), cường độ xuất khẩu cao hơn lại gắn với năng suất thấp hơn, khiến đường cong chữ U ngược sụp đổ hoàn toàn thành một quan hệ âm đơn điệu. Hiện tượng này, mà luận án gọi là</w:t>
+      </w:r>
+      <w:r>
+        <w:t xml:space="preserve"> </w:t>
+      </w:r>
+      <w:r>
+        <w:rPr>
+          <w:bCs/>
+          <w:b/>
+        </w:rPr>
+        <w:t xml:space="preserve">gánh nặng quốc tế hóa bắt buộc</w:t>
+      </w:r>
+      <w:r>
+        <w:t xml:space="preserve"> </w:t>
+      </w:r>
+      <w:r>
+        <w:t xml:space="preserve">(Forced Internationalization Penalty, FIP), không phải một ngoại lệ bên lề mà là điều kiện biên cực đoan làm lộ rõ chính cấu trúc lý thuyết của toàn bộ quan hệ I-P: khi cả ba tiền đề cấu trúc của đường cong chữ U ngược, gồm thị trường nội địa khả dụng, chi phí thương mại quản lý được, và thể chế hỗ trợ chức năng, đồng thời vắng mặt, thì dạng hàm phi tuyến quen thuộc không còn tồn tại. Cũng như một lý thuyết về lực hấp dẫn không thể trọn vẹn nếu né tránh điểm kỳ dị nơi các định luật thông thường sụp đổ, một lý thuyết về quan hệ I-P không thể xem trường hợp FIP như một phụ lục: luận án do đó đặt FIP làm một cực lý thuyết đối trọng trực tiếp với logic chữ U ngược truyền thống, ngay từ chương mở đầu.</w:t>
       </w:r>
     </w:p>
     <w:p>
@@ -3785,7 +3841,7 @@
         <w:pStyle w:val="BodyText"/>
       </w:pPr>
       <w:r>
-        <w:t xml:space="preserve">Dạng hàm thứ tư là chữ M với hai điểm uốn, phản ánh tính không đồng nhất của lợi ích quốc tế hóa theo loại thị trường (Riahi-Belkaoui, 1998), song bằng chứng thực nghiệm hạn chế và khó tái lập. Dạng hàm thứ năm là gánh nặng bắt buộc, biểu hiện thành quan hệ tuyến tính âm trong các nền kinh tế buộc phải quốc tế hóa do thị trường nội địa quá nhỏ; đây là pattern đặc thù của các quốc đảo nhỏ Thái Bình Dương, nơi doanh nghiệp phải xuất khẩu để tồn tại nhưng thiếu năng lực cạnh tranh (Briguglio, 1995; Bertram, 2006).</w:t>
+        <w:t xml:space="preserve">Dạng hàm thứ tư là chữ M với hai điểm uốn, phản ánh tính không đồng nhất của lợi ích quốc tế hóa theo loại thị trường (Riahi-Belkaoui, 1998), song bằng chứng thực nghiệm hạn chế và khó tái lập. Dạng hàm thứ năm là gánh nặng quốc tế hóa bắt buộc, biểu hiện thành quan hệ tuyến tính âm trong các nền kinh tế buộc phải quốc tế hóa do thị trường nội địa quá nhỏ; đây là dạng đặc thù của các quốc đảo nhỏ Thái Bình Dương, nơi doanh nghiệp phải xuất khẩu để tồn tại nhưng thiếu năng lực cạnh tranh (Briguglio, 1995; Bertram, 2006). Năm dạng hàm này thực chất sắp xếp dọc theo một trục đối lập giữa hai chế độ quốc tế hóa: ở một đầu là quốc tế hóa để mở rộng quy mô, nơi xuất khẩu tối ưu hóa lợi nhuận và đường cong còn dư địa sinh lợi đến cường độ cao; ở đầu kia là quốc tế hóa để sinh tồn, nơi xuất khẩu là bắt buộc và dạng phi tuyến quen thuộc sụp đổ thành âm đơn điệu. Dạng hàm thứ năm do đó không phải một ngoại lệ thứ yếu mà là cực biên làm lộ rõ các tiền đề cấu trúc mà bốn dạng còn lại ngầm giả định.</w:t>
       </w:r>
     </w:p>
     <w:p>
@@ -39753,7 +39809,7 @@
         <w:t xml:space="preserve">Điểm uốn thấp, khoảng 39-46% FSTS, là một cảnh báo cụ thể cho doanh nghiệp xuất khẩu thủy sản và gạo Đồng bằng sông Cửu Long</w:t>
       </w:r>
       <w:r>
-        <w:t xml:space="preserve">, nơi FSTS cấu trúc thường vượt 50-70% tổng doanh thu. Kết quả phân tích Việt Nam gợi ý rằng nhiều doanh nghiệp trong số đó có thể đang ở phía bên kia điểm uốn, tức đang gánh chi phí phối hợp quốc tế mà hiệu quả không tăng tương ứng. Giải pháp không phải là giảm xuất khẩu, bởi không có thị trường nội địa để thay thế, mà là</w:t>
+        <w:t xml:space="preserve">, nơi cấu trúc ngành buộc tỷ trọng xuất khẩu thường vượt 50-70% tổng doanh thu. Kết quả phân tích Việt Nam gợi ý rằng nhiều doanh nghiệp trong số đó đang ở phía bên phải điểm uốn, tức đang gánh chi phí phối hợp quốc tế mà năng suất không tăng tương ứng. Vì không có thị trường nội địa đủ lớn để thay thế, giải pháp không thể là giảm xuất khẩu, mà phải là</w:t>
       </w:r>
       <w:r>
         <w:t xml:space="preserve"> </w:t>
@@ -39763,21 +39819,36 @@
           <w:bCs/>
           <w:b/>
         </w:rPr>
-        <w:t xml:space="preserve">nâng TCI song song</w:t>
-      </w:r>
-      <w:r>
-        <w:t xml:space="preserve"> </w:t>
-      </w:r>
-      <w:r>
-        <w:t xml:space="preserve">nhằm đẩy điểm uốn sang phải, mở rộng biên lợi ích của xuất khẩu.</w:t>
-      </w:r>
-    </w:p>
-    <w:p>
-      <w:pPr>
-        <w:pStyle w:val="BodyText"/>
-      </w:pPr>
-      <w:r>
-        <w:t xml:space="preserve">Mức</w:t>
+        <w:t xml:space="preserve">kéo dài đỉnh của đường cong chữ U</w:t>
+      </w:r>
+      <w:r>
+        <w:t xml:space="preserve">, tức mở rộng vùng cường độ xuất khẩu còn sinh lợi bằng cách nâng năng lực để đẩy điểm uốn sang phải.</w:t>
+      </w:r>
+    </w:p>
+    <w:p>
+      <w:pPr>
+        <w:pStyle w:val="BodyText"/>
+      </w:pPr>
+      <w:r>
+        <w:t xml:space="preserve">Điều then chốt là phải dịch khái niệm trừu tượng</w:t>
+      </w:r>
+      <w:r>
+        <w:t xml:space="preserve"> </w:t>
+      </w:r>
+      <w:r>
+        <w:t xml:space="preserve">“</w:t>
+      </w:r>
+      <w:r>
+        <w:t xml:space="preserve">nâng TCI</w:t>
+      </w:r>
+      <w:r>
+        <w:t xml:space="preserve">”</w:t>
+      </w:r>
+      <w:r>
+        <w:t xml:space="preserve"> </w:t>
+      </w:r>
+      <w:r>
+        <w:t xml:space="preserve">thành một lộ trình hành động gắn chặt với đặc thù chuỗi cung ứng nông – thủy sản, thay vì một khuyến nghị chung chung. Với một nhà máy chế biến cá tra hay tôm, nâng TCI không có nghĩa là theo đuổi công nghệ cao trừu tượng, mà cụ thể là</w:t>
       </w:r>
       <w:r>
         <w:t xml:space="preserve"> </w:t>
@@ -39787,13 +39858,18 @@
           <w:bCs/>
           <w:b/>
         </w:rPr>
-        <w:t xml:space="preserve">DAI Tier-1, đo bằng mức chấp nhận trang web,</w:t>
-      </w:r>
-      <w:r>
-        <w:t xml:space="preserve"> </w:t>
-      </w:r>
-      <w:r>
-        <w:t xml:space="preserve">tại Đồng bằng sông Cửu Long vẫn còn thấp so với trung bình cả nước. phân tích Việt Nam cho thấy DAI Tier-1 đơn thuần không có tác động đáng kể, nhưng bằng chứng từ phân tích Singapore (Tier-1+2) lại cho thấy khi doanh nghiệp nâng lên DAI Tier-2, gồm trang web cùng thanh toán điện tử và kết nối nhà cung ứng số, hiệu ứng điều tiết hiện ra rõ rệt. Đây là cơ sở để ưu tiên các chương trình chuyển đổi số</w:t>
+        <w:t xml:space="preserve">đạt các chứng nhận chất lượng quốc tế khắt khe như ASC (Aquaculture Stewardship Council) và BAP (Best Aquaculture Practices) cho thủy sản, hoặc GlobalGAP và SRP (Sustainable Rice Platform) cho gạo</w:t>
+      </w:r>
+      <w:r>
+        <w:t xml:space="preserve">. Trong ngữ cảnh này, chứng nhận vận hành như một thứ vũ khí kép: nó giúp doanh nghiệp vượt qua các rào cản kỹ thuật trong thương mại (TBT/SPS) tại các thị trường EU, Hoa Kỳ và Nhật Bản, đồng thời biến chính chi phí tuân thủ thành một rào cản gia nhập đối với đối thủ năng lực thấp hơn, qua đó nâng biên lợi nhuận trên mỗi đơn vị xuất khẩu và đẩy điểm uốn về phía cường độ cao hơn.</w:t>
+      </w:r>
+    </w:p>
+    <w:p>
+      <w:pPr>
+        <w:pStyle w:val="BodyText"/>
+      </w:pPr>
+      <w:r>
+        <w:t xml:space="preserve">Về số hóa, bằng chứng đối chiếu giữa kết quả không có ý nghĩa (null) của DAI Tier-1 tại Việt Nam và hiệu ứng khuếch đại mạnh của DAI Tier-1+2 tại Singapore cung cấp một minh chứng thực nghiệm sắc bén: ở một thị trường chuyển đổi như Việt Nam, số hóa Tier-1 (chỉ gồm trang web, thư điện tử) đã trở thành một</w:t>
       </w:r>
       <w:r>
         <w:t xml:space="preserve"> </w:t>
@@ -39803,10 +39879,92 @@
           <w:bCs/>
           <w:b/>
         </w:rPr>
-        <w:t xml:space="preserve">toàn diện</w:t>
-      </w:r>
-      <w:r>
-        <w:t xml:space="preserve">, không dừng ở trang web ở mức nền tảng (Tier-1), mà tiến tới tích hợp thanh toán điện tử và kết nối nhà cung ứng số ở Tier-2, đúng tinh thần Chương trình Chuyển đổi số Quốc gia 2025-2030. Nghiên cứu trên dữ liệu WBES Việt Nam 2023, đợt khảo sát gần nhất, sẽ cung cấp bằng chứng cập nhật hơn cho các hàm ý này.</w:t>
+        <w:t xml:space="preserve">yếu tố vệ sinh</w:t>
+      </w:r>
+      <w:r>
+        <w:t xml:space="preserve"> </w:t>
+      </w:r>
+      <w:r>
+        <w:t xml:space="preserve">(hygiene factor) phổ cập, hiện diện gần như khắp nơi nên không còn tạo khác biệt cạnh tranh và không đủ sức uốn cong đường hiệu quả. Hàm ý cho Đồng bằng sông Cửu Long do đó không phải là</w:t>
+      </w:r>
+      <w:r>
+        <w:t xml:space="preserve"> </w:t>
+      </w:r>
+      <w:r>
+        <w:t xml:space="preserve">“</w:t>
+      </w:r>
+      <w:r>
+        <w:t xml:space="preserve">chuyển đổi số</w:t>
+      </w:r>
+      <w:r>
+        <w:t xml:space="preserve">”</w:t>
+      </w:r>
+      <w:r>
+        <w:t xml:space="preserve"> </w:t>
+      </w:r>
+      <w:r>
+        <w:t xml:space="preserve">chung chung, mà là vượt qua</w:t>
+      </w:r>
+      <w:r>
+        <w:t xml:space="preserve"> </w:t>
+      </w:r>
+      <w:r>
+        <w:rPr>
+          <w:bCs/>
+          <w:b/>
+        </w:rPr>
+        <w:t xml:space="preserve">ngưỡng độ sâu</w:t>
+      </w:r>
+      <w:r>
+        <w:t xml:space="preserve"> </w:t>
+      </w:r>
+      <w:r>
+        <w:t xml:space="preserve">từ Tier-1 lên Tier-2, nơi năng lực số mới thực sự phát huy vai trò nguồn lực phụ thuộc bối cảnh và khuếch đại lợi nhuận ở mức quốc tế hóa cao. Cụ thể, DAI Tier-2 trong ngành nông – thủy sản chính là</w:t>
+      </w:r>
+      <w:r>
+        <w:t xml:space="preserve"> </w:t>
+      </w:r>
+      <w:r>
+        <w:rPr>
+          <w:bCs/>
+          <w:b/>
+        </w:rPr>
+        <w:t xml:space="preserve">hệ thống truy xuất nguồn gốc trên nền blockchain</w:t>
+      </w:r>
+      <w:r>
+        <w:t xml:space="preserve"> </w:t>
+      </w:r>
+      <w:r>
+        <w:t xml:space="preserve">và</w:t>
+      </w:r>
+      <w:r>
+        <w:t xml:space="preserve"> </w:t>
+      </w:r>
+      <w:r>
+        <w:rPr>
+          <w:bCs/>
+          <w:b/>
+        </w:rPr>
+        <w:t xml:space="preserve">phần mềm ERP kết nối trực tiếp nhà máy với hộ nông dân và vùng nuôi</w:t>
+      </w:r>
+      <w:r>
+        <w:t xml:space="preserve">, kèm thanh toán điện tử xuyên suốt chuỗi. Đây chính là cơ chế</w:t>
+      </w:r>
+      <w:r>
+        <w:t xml:space="preserve"> </w:t>
+      </w:r>
+      <w:r>
+        <w:rPr>
+          <w:bCs/>
+          <w:b/>
+        </w:rPr>
+        <w:t xml:space="preserve">thay thế số cho thể chế</w:t>
+      </w:r>
+      <w:r>
+        <w:t xml:space="preserve"> </w:t>
+      </w:r>
+      <w:r>
+        <w:t xml:space="preserve">(digital-for-institutional substitution): ở nơi thể chế trung gian địa phương còn khoảng trống (hợp đồng khó thực thi, thông tin thị trường thiếu, chuẩn chất lượng khó giám sát), các công cụ số này hạ chi phí giao dịch bị đội lên do khoảng trống thể chế, đồng thời đáp ứng yêu cầu minh bạch nguồn gốc ngày càng ngặt nghèo từ nhà nhập khẩu. Bằng cách định nghĩa lại TCI và DAI bằng đúng ngôn ngữ của ngành hàng, các đề xuất này chuyển từ khuyến nghị hàn lâm sang một cẩm nang công nghệ khả thi cho doanh nghiệp và nhà hoạch định chính sách vùng, đúng tinh thần Chương trình Chuyển đổi số Quốc gia 2025-2030. Nghiên cứu trên dữ liệu WBES Việt Nam 2023, đợt khảo sát gần nhất, sẽ cung cấp bằng chứng cập nhật hơn cho các hàm ý này.</w:t>
       </w:r>
     </w:p>
     <w:p>
@@ -39842,6 +40000,61 @@
       </w:pPr>
       <w:r>
         <w:t xml:space="preserve">Hạn chế quan trọng nhất của luận án nằm ở việc đo lường DAI. Dữ liệu WBES chỉ cung cấp một số ít chỉ báo để xây dựng chỉ số DAI, và các chỉ báo này lại thay đổi qua các thế hệ lược đồ khảo sát WBES (PICS3, lược đồ chuẩn hóa, BREADY/BEE). Tại Việt Nam (Việt Nam), chỉ DAI Tier-1, gồm trang web, thư điện tử và bán hàng trực tuyến, được sử dụng, do giới hạn của các đợt khảo sát 2009 và 2015; còn Tier-2, gồm thanh toán điện tử và kết nối nhà cung ứng số, mãi đến năm 2023 mới có. Điều này dẫn đến nguy cơ đo lường không đầy đủ, đặc biệt là không nắm bắt được chiều sâu năng lực số ở các bối cảnh ICRV thấp.</w:t>
+      </w:r>
+    </w:p>
+    <w:p>
+      <w:pPr>
+        <w:pStyle w:val="BodyText"/>
+      </w:pPr>
+      <w:r>
+        <w:t xml:space="preserve">Tuy nhiên, cần phân biệt rõ giữa một giới hạn đo lường thuần túy và một phát hiện lý thuyết bị che lấp dưới hình thức giới hạn đo lường. Việc giải thích kết quả null của DAI tại Việt Nam đơn thuần như một khiếm khuyết dữ liệu của WBES là một lập luận phòng thủ và khiên cưỡng. Một cách diễn giải chặt chẽ hơn là xem Tier-1 không phải</w:t>
+      </w:r>
+      <w:r>
+        <w:t xml:space="preserve"> </w:t>
+      </w:r>
+      <w:r>
+        <w:t xml:space="preserve">“</w:t>
+      </w:r>
+      <w:r>
+        <w:t xml:space="preserve">dữ liệu kém</w:t>
+      </w:r>
+      <w:r>
+        <w:t xml:space="preserve">”</w:t>
+      </w:r>
+      <w:r>
+        <w:t xml:space="preserve"> </w:t>
+      </w:r>
+      <w:r>
+        <w:t xml:space="preserve">mà là một</w:t>
+      </w:r>
+      <w:r>
+        <w:t xml:space="preserve"> </w:t>
+      </w:r>
+      <w:r>
+        <w:rPr>
+          <w:bCs/>
+          <w:b/>
+        </w:rPr>
+        <w:t xml:space="preserve">rào cản tối thiểu đã bị bão hòa</w:t>
+      </w:r>
+      <w:r>
+        <w:t xml:space="preserve">: tại các thị trường chuyển đổi, sự hiện diện số ở mức Tier-1 (có trang web, thư điện tử) đã phổ cập đến mức trở thành yếu tố vệ sinh, hiện diện gần như đồng đều giữa các doanh nghiệp nên không còn phương sai đủ để tạo khác biệt cạnh tranh hay làm bộ đệm uốn cong đường hiệu quả. Theo cách đọc này, kết quả null tại Việt Nam (chỉ Tier-1) đặt cạnh hiệu ứng khuếch đại có ý nghĩa tại Singapore (Tier-1+2) không phải là hai mảnh bằng chứng mâu thuẫn, mà cùng xác nhận một mệnh đề lý thuyết duy nhất: DAI là một nguồn lực phụ thuộc bối cảnh đòi hỏi một</w:t>
+      </w:r>
+      <w:r>
+        <w:t xml:space="preserve"> </w:t>
+      </w:r>
+      <w:r>
+        <w:rPr>
+          <w:bCs/>
+          <w:b/>
+        </w:rPr>
+        <w:t xml:space="preserve">ngưỡng độ sâu</w:t>
+      </w:r>
+      <w:r>
+        <w:t xml:space="preserve"> </w:t>
+      </w:r>
+      <w:r>
+        <w:t xml:space="preserve">nhất định, là sự chuyển dịch từ số hóa thông tin sang tích hợp số vào quy trình, mới đủ sức điều tiết quan hệ I-P. Diễn giải này biến một điểm yếu phương pháp thành một đóng góp lý thuyết, đồng thời định hướng cụ thể cho việc đo lường DAI đa tầng trong các nghiên cứu tương lai.</w:t>
       </w:r>
     </w:p>
     <w:p>

</xml_diff>

<commit_message>
build: rebuild P6/ICRV-affected DOCX/PDF to match drop-Frontier sensitivity edits
Targeted rebuild (not full dist) of deliverables derived from the changed
sources: chapters 2/4/5, P6 manuscripts (VI/EN), TOM_TAT, both LUAN_AN_FULL,
and the luan_an_ctu + manuscripts/en packages (incl. source_md copies). Each
output verified to carry the drop-FR result (Q_M=1.49, p=.68); LUAN_AN_FULL
structure (front matter + 5 chapters + references) and word count confirmed intact.
</commit_message>
<xml_diff>
--- a/dist/downloads/LUAN_AN_FULL_vi.docx
+++ b/dist/downloads/LUAN_AN_FULL_vi.docx
@@ -1685,7 +1685,7 @@
         <w:pStyle w:val="BodyText"/>
       </w:pPr>
       <w:r>
-        <w:t xml:space="preserve">Ở châu Á, bối cảnh này càng trở nên đặc biệt đáng quan tâm vì khu vực đang chứng kiến tốc độ hội nhập kinh tế và chuyển đổi số hết sức không đồng đều giữa các quốc gia. Từ Singapore, một nền kinh tế nhỏ mở, dẫn đầu thế giới về năng lực đổi mới và kết nối toàn cầu, đến Việt Nam, một nền kinh tế chuyển đổi đang đẩy nhanh cải cách thể chế và hội nhập quốc tế, rồi đến Trung Quốc với quy mô thị trường khổng lồ và cấu trúc thể chế đặc thù, thậm chí đến các quốc đảo nhỏ Thái Bình Dương đang phải đối mặt với thách thức sinh tồn kép của biến đổi khí hậu và sự phụ thuộc xuất khẩu bắt buộc, sự đa dạng này tạo ra một phòng thí nghiệm thực địa hiếm có để kiểm định các điều kiện biên của quan hệ I-P (Khanna &amp; Palepu, 2010; Peng, 2003). Sự đồng tồn tại của nhiều chế độ thể chế khác nhau trong cùng một khoảng thời gian và trên cùng một nguồn dữ liệu chuẩn hóa cho phép phân tách hiệu ứng thể chế khỏi hiệu ứng thời kỳ, điều mà các nghiên cứu đơn quốc gia khó lòng thực hiện.</w:t>
+        <w:t xml:space="preserve">Ở châu Á, bối cảnh này càng trở nên đặc biệt đáng quan tâm vì khu vực đang chứng kiến tốc độ hội nhập kinh tế và chuyển đổi số không đồng đều giữa các quốc gia. Từ Singapore, một nền kinh tế nhỏ mở, dẫn đầu thế giới về năng lực đổi mới và kết nối toàn cầu, đến Việt Nam, một nền kinh tế chuyển đổi đang đẩy nhanh cải cách thể chế và hội nhập quốc tế, rồi đến Trung Quốc với quy mô thị trường khổng lồ và cấu trúc thể chế đặc thù, thậm chí đến các quốc đảo nhỏ Thái Bình Dương đang phải đối mặt với thách thức sinh tồn kép của biến đổi khí hậu và sự phụ thuộc xuất khẩu bắt buộc, sự đa dạng này tạo ra một phòng thí nghiệm thực địa hiếm có để kiểm định các điều kiện biên của quan hệ I-P (Khanna &amp; Palepu, 2010; Peng, 2003). Sự đồng tồn tại của nhiều chế độ thể chế khác nhau trong cùng một khoảng thời gian và trên cùng một nguồn dữ liệu chuẩn hóa cho phép phân tách hiệu ứng thể chế khỏi hiệu ứng thời kỳ, điều mà các nghiên cứu đơn quốc gia khó lòng thực hiện.</w:t>
       </w:r>
     </w:p>
     <w:p>
@@ -3988,7 +3988,20 @@
         <w:pStyle w:val="BodyText"/>
       </w:pPr>
       <w:r>
-        <w:t xml:space="preserve">Tổng kết bằng chứng tổng hợp gợi ra ba kết luận. Tác động trung bình I-P là dương nhưng khiêm tốn, vào khoảng r = 0,04-0,07; mức dị biệt giữa các nghiên cứu thì cực kỳ cao; và các yếu tố điều tiết bối cảnh, nhất là thể chế quốc gia, năng lực doanh nghiệp và đặc điểm ngành, mới là nguồn giải thích chính cho sự khác biệt. Luận án mở rộng dòng nghiên cứu này qua Nghiên cứu phân tích tổng hợp, một phân tích tổng hợp ba tầng theo giao thức PRISMA 2020 với k = 238 nghiên cứu và K = 288 mức độ ảnh hưởng từ châu Á và Thái Bình Dương. phân tích tổng hợp ước lượng tác động tổng hợp r = 0,074 (khoảng tin cậy 95%: 0,060; 0,088), với I² = 62,4%, tái lập và mở rộng mức cơ sở trước đó (r = 0,07, k = 113). Kiểm định khác biệt giữa các chế độ ICRV có ý nghĩa thống kê (Q_M = 17,35, df = 4, p = 0,002), xác nhận rằng dải biến thiên thể chế là một nguồn dị biệt thực chất, dù khác biệt từng cặp phần nào phản ánh thành phần nghiên cứu đơn quốc gia so với đa quốc gia. phân tích tổng hợp cũng phát hiện thiên lệch xuất bản đáng kể: phương pháp trim-and-fill bổ khuyết 58 nghiên cứu còn thiếu, kéo tác động tổng hợp điều chỉnh xuống r = 0,035, vẫn dương nhưng bị suy giảm. Kết quả này vừa xác nhận tác động dương nhỏ và bền vững, vừa nhấn mạnh rằng giá trị thực sự của nghiên cứu I-P nằm ở việc giải thích dị biệt, chứ không phải ở việc đo lại hiệu ứng trung bình.</w:t>
+        <w:t xml:space="preserve">Tổng kết bằng chứng tổng hợp gợi ra ba kết luận. Tác động trung bình I-P là dương nhưng khiêm tốn, vào khoảng r = 0,04-0,07; mức dị biệt giữa các nghiên cứu thì cực kỳ cao; và các yếu tố điều tiết bối cảnh, nhất là thể chế quốc gia, năng lực doanh nghiệp và đặc điểm ngành, mới là nguồn giải thích chính cho sự khác biệt. Luận án mở rộng dòng nghiên cứu này qua Nghiên cứu phân tích tổng hợp, một phân tích tổng hợp ba tầng theo giao thức PRISMA 2020 với k = 238 nghiên cứu và K = 288 mức độ ảnh hưởng từ 49 nền kinh tế trên toàn cầu (đa số thuộc châu Á – Thái Bình Dương). phân tích tổng hợp ước lượng tác động tổng hợp r = 0,074 (khoảng tin cậy 95%: 0,060; 0,088), với I² = 62,4%, tái lập và mở rộng mức cơ sở trước đó (r = 0,07, k = 113). Kiểm định khác biệt giữa các chế độ ICRV có ý nghĩa thống kê trên toàn mẫu (Q_M = 17,35, df = 4, p = 0,002) nhưng</w:t>
+      </w:r>
+      <w:r>
+        <w:t xml:space="preserve"> </w:t>
+      </w:r>
+      <w:r>
+        <w:rPr>
+          <w:bCs/>
+          <w:b/>
+        </w:rPr>
+        <w:t xml:space="preserve">không bền vững</w:t>
+      </w:r>
+      <w:r>
+        <w:t xml:space="preserve">: kiểm định nhạy cảm bỏ ô Frontier (k = 3) đưa omnibus về không có ý nghĩa (Q_M = 1,49, p = 0,68), cho thấy ở cấp văn liệu điều tiết thể chế trực tiếp (chủ hiệu ứng phân nhóm) là yếu. Tính ngữ cảnh thể chế của quan hệ I-P do đó được luận án kiểm định mạnh hơn ở cấp doanh nghiệp qua tương tác có điều kiện (Chương 4), nơi vai trò điều tiết của chế độ thể chế bộc lộ robust. phân tích tổng hợp cũng phát hiện thiên lệch xuất bản đáng kể: phương pháp trim-and-fill bổ khuyết 58 nghiên cứu còn thiếu, kéo tác động tổng hợp điều chỉnh xuống r = 0,035, vẫn dương nhưng bị suy giảm. Kết quả này vừa xác nhận tác động dương nhỏ và bền vững, vừa nhấn mạnh rằng giá trị thực sự của nghiên cứu I-P nằm ở việc giải thích dị biệt, chứ không phải ở việc đo lại hiệu ứng trung bình.</w:t>
       </w:r>
     </w:p>
     <w:bookmarkEnd w:id="56"/>
@@ -27327,7 +27340,7 @@
         <w:pStyle w:val="FirstParagraph"/>
       </w:pPr>
       <w:r>
-        <w:t xml:space="preserve">Kiểm định điều tiết theo nhóm chế độ thể chế ICRV cho kết quả có ý nghĩa thống kê:</w:t>
+        <w:t xml:space="preserve">Kiểm định điều tiết theo nhóm chế độ thể chế ICRV cho kết quả có ý nghĩa thống kê trên toàn mẫu:</w:t>
       </w:r>
     </w:p>
     <w:p>
@@ -27449,7 +27462,60 @@
         <w:pStyle w:val="FirstParagraph"/>
       </w:pPr>
       <w:r>
-        <w:t xml:space="preserve">Kết quả này xác nhận chế độ thể chế, được phân loại từ nhóm tiên tiến dẫn dắt bằng đổi mới đến nhóm đảo nhỏ Thái Bình Dương, là một yếu tố điều tiết thực sự có ý nghĩa cho quan hệ gộp I-P. Việc</w:t>
+        <w:t xml:space="preserve">Tuy vậy, kết quả omnibus này cần diễn giải thận trọng vì</w:t>
+      </w:r>
+      <w:r>
+        <w:t xml:space="preserve"> </w:t>
+      </w:r>
+      <w:r>
+        <w:rPr>
+          <w:bCs/>
+          <w:b/>
+        </w:rPr>
+        <w:t xml:space="preserve">không bền vững</w:t>
+      </w:r>
+      <w:r>
+        <w:t xml:space="preserve">: như trình bày dưới đây, toàn bộ ý nghĩa thống kê do một ô nhỏ duy nhất (Frontier,</w:t>
+      </w:r>
+      <w:r>
+        <w:t xml:space="preserve"> </w:t>
+      </w:r>
+      <m:oMath>
+        <m:r>
+          <m:t>K</m:t>
+        </m:r>
+        <m:r>
+          <m:rPr>
+            <m:sty m:val="p"/>
+          </m:rPr>
+          <m:t>=</m:t>
+        </m:r>
+        <m:r>
+          <m:t>3</m:t>
+        </m:r>
+      </m:oMath>
+      <w:r>
+        <w:t xml:space="preserve">) tạo ra, và kiểm định nhạy cảm bỏ ô này — ước lượng lại trên bốn chế độ đông dữ liệu (I/II/III/MX,</w:t>
+      </w:r>
+      <w:r>
+        <w:t xml:space="preserve"> </w:t>
+      </w:r>
+      <m:oMath>
+        <m:r>
+          <m:t>K</m:t>
+        </m:r>
+        <m:r>
+          <m:rPr>
+            <m:sty m:val="p"/>
+          </m:rPr>
+          <m:t>=</m:t>
+        </m:r>
+        <m:r>
+          <m:t>285</m:t>
+        </m:r>
+      </m:oMath>
+      <w:r>
+        <w:t xml:space="preserve">) — đưa</w:t>
       </w:r>
       <w:r>
         <w:t xml:space="preserve"> </w:t>
@@ -27472,9 +27538,70 @@
         <w:t xml:space="preserve"> </w:t>
       </w:r>
       <w:r>
-        <w:t xml:space="preserve">vượt ngưỡng tới hạn (</w:t>
+        <w:t xml:space="preserve">về không có ý nghĩa (</w:t>
       </w:r>
       <m:oMath>
+        <m:sSub>
+          <m:e>
+            <m:r>
+              <m:t>Q</m:t>
+            </m:r>
+          </m:e>
+          <m:sub>
+            <m:r>
+              <m:t>M</m:t>
+            </m:r>
+          </m:sub>
+        </m:sSub>
+        <m:r>
+          <m:rPr>
+            <m:sty m:val="p"/>
+          </m:rPr>
+          <m:t>=</m:t>
+        </m:r>
+        <m:r>
+          <m:t>1</m:t>
+        </m:r>
+        <m:r>
+          <m:rPr>
+            <m:sty m:val="p"/>
+          </m:rPr>
+          <m:t>,</m:t>
+        </m:r>
+        <m:r>
+          <m:t>49</m:t>
+        </m:r>
+      </m:oMath>
+      <w:r>
+        <w:t xml:space="preserve">,</w:t>
+      </w:r>
+      <w:r>
+        <w:t xml:space="preserve"> </w:t>
+      </w:r>
+      <m:oMath>
+        <m:r>
+          <m:t>d</m:t>
+        </m:r>
+        <m:r>
+          <m:t>f</m:t>
+        </m:r>
+        <m:r>
+          <m:rPr>
+            <m:sty m:val="p"/>
+          </m:rPr>
+          <m:t>=</m:t>
+        </m:r>
+        <m:r>
+          <m:t>3</m:t>
+        </m:r>
+      </m:oMath>
+      <w:r>
+        <w:t xml:space="preserve">,</w:t>
+      </w:r>
+      <w:r>
+        <w:t xml:space="preserve"> </w:t>
+      </w:r>
+      <m:oMath>
         <m:r>
           <m:t>p</m:t>
         </m:r>
@@ -27491,11 +27618,40 @@
           <m:t>,</m:t>
         </m:r>
         <m:r>
-          <m:t>002</m:t>
+          <m:t>68</m:t>
         </m:r>
       </m:oMath>
       <w:r>
-        <w:t xml:space="preserve">) hàm ý rằng khác biệt giữa các nhóm ICRV không thể quy về sai số lấy mẫu.</w:t>
+        <w:t xml:space="preserve">), ngang bằng với cDAI và DPL. Nói cách khác, ở cấp phân tích tổng hợp,</w:t>
+      </w:r>
+      <w:r>
+        <w:t xml:space="preserve"> </w:t>
+      </w:r>
+      <w:r>
+        <w:rPr>
+          <w:bCs/>
+          <w:b/>
+        </w:rPr>
+        <w:t xml:space="preserve">điều tiết thể chế trực tiếp dưới dạng hiệu ứng chính phân nhóm là yếu và không robust</w:t>
+      </w:r>
+      <w:r>
+        <w:t xml:space="preserve">. Đây không phải hạn chế làm suy yếu luận án, mà chính là khoảng trống định hướng cho phần tiếp theo: tính ngữ cảnh thể chế của quan hệ I-P không bộc lộ qua việc gộp chủ hiệu ứng phân nhóm ở cấp văn liệu, mà chỉ hiện ra khi mô hình hóa</w:t>
+      </w:r>
+      <w:r>
+        <w:t xml:space="preserve"> </w:t>
+      </w:r>
+      <w:r>
+        <w:rPr>
+          <w:bCs/>
+          <w:b/>
+        </w:rPr>
+        <w:t xml:space="preserve">có điều kiện (tương tác)</w:t>
+      </w:r>
+      <w:r>
+        <w:t xml:space="preserve"> </w:t>
+      </w:r>
+      <w:r>
+        <w:t xml:space="preserve">ở cấp doanh nghiệp (Mục 4.3).</w:t>
       </w:r>
     </w:p>
     <w:p>
@@ -28184,7 +28340,7 @@
         <w:t xml:space="preserve"> </w:t>
       </w:r>
       <w:r>
-        <w:t xml:space="preserve">chủ yếu đến từ ô Frontier (</w:t>
+        <w:t xml:space="preserve">gần như hoàn toàn đến từ ô Frontier (</w:t>
       </w:r>
       <m:oMath>
         <m:acc>
@@ -28237,7 +28393,126 @@
         </m:r>
       </m:oMath>
       <w:r>
-        <w:t xml:space="preserve">), ô duy nhất có khoảng tin cậy không giao với hiệu ứng gộp. Tuy nhiên ô này chỉ dựa trên ba mức độ ảnh hưởng, trong đó có một giá trị ngoại lai, nên còn mong manh về mặt thống kê. Phát hiện vững chắc của phân tích tổng hợp do đó là sự khác biệt giữa nghiên cứu đơn quốc gia với nghiên cứu đa quốc gia, chứ chưa phải một dải biến thiên đơn điệu theo chất lượng thể chế. Dải biến thiên định hướng này sau đó được xác nhận độc lập bằng dữ liệu sơ cấp trong phân tích đa quốc gia (Mục 4.3).</w:t>
+        <w:t xml:space="preserve">), ô duy nhất có khoảng tin cậy không giao với hiệu ứng gộp. Ô này chỉ dựa trên ba mức độ ảnh hưởng, trong đó có một giá trị ngoại lai, nên rất mong manh về mặt thống kê; kiểm định nhạy cảm bỏ ô Frontier đưa omnibus liên nhóm về</w:t>
+      </w:r>
+      <w:r>
+        <w:t xml:space="preserve"> </w:t>
+      </w:r>
+      <m:oMath>
+        <m:sSub>
+          <m:e>
+            <m:r>
+              <m:t>Q</m:t>
+            </m:r>
+          </m:e>
+          <m:sub>
+            <m:r>
+              <m:t>M</m:t>
+            </m:r>
+          </m:sub>
+        </m:sSub>
+        <m:r>
+          <m:rPr>
+            <m:sty m:val="p"/>
+          </m:rPr>
+          <m:t>=</m:t>
+        </m:r>
+        <m:r>
+          <m:t>1</m:t>
+        </m:r>
+        <m:r>
+          <m:rPr>
+            <m:sty m:val="p"/>
+          </m:rPr>
+          <m:t>,</m:t>
+        </m:r>
+        <m:r>
+          <m:t>49</m:t>
+        </m:r>
+      </m:oMath>
+      <w:r>
+        <w:t xml:space="preserve"> </w:t>
+      </w:r>
+      <w:r>
+        <w:t xml:space="preserve">(</w:t>
+      </w:r>
+      <m:oMath>
+        <m:r>
+          <m:t>d</m:t>
+        </m:r>
+        <m:r>
+          <m:t>f</m:t>
+        </m:r>
+        <m:r>
+          <m:rPr>
+            <m:sty m:val="p"/>
+          </m:rPr>
+          <m:t>=</m:t>
+        </m:r>
+        <m:r>
+          <m:t>3</m:t>
+        </m:r>
+      </m:oMath>
+      <w:r>
+        <w:t xml:space="preserve">,</w:t>
+      </w:r>
+      <w:r>
+        <w:t xml:space="preserve"> </w:t>
+      </w:r>
+      <m:oMath>
+        <m:r>
+          <m:t>p</m:t>
+        </m:r>
+        <m:r>
+          <m:rPr>
+            <m:sty m:val="p"/>
+          </m:rPr>
+          <m:t>=</m:t>
+        </m:r>
+        <m:r>
+          <m:rPr>
+            <m:sty m:val="p"/>
+          </m:rPr>
+          <m:t>,</m:t>
+        </m:r>
+        <m:r>
+          <m:t>68</m:t>
+        </m:r>
+      </m:oMath>
+      <w:r>
+        <w:t xml:space="preserve">) — không có ý nghĩa. Do đó phân tích tổng hợp</w:t>
+      </w:r>
+      <w:r>
+        <w:t xml:space="preserve"> </w:t>
+      </w:r>
+      <w:r>
+        <w:rPr>
+          <w:bCs/>
+          <w:b/>
+        </w:rPr>
+        <w:t xml:space="preserve">không</w:t>
+      </w:r>
+      <w:r>
+        <w:t xml:space="preserve"> </w:t>
+      </w:r>
+      <w:r>
+        <w:t xml:space="preserve">cung cấp bằng chứng robust về một dải biến thiên thể chế đơn điệu, cũng không về điều tiết thể chế trực tiếp nói chung; điều vững chắc duy nhất là hiệu ứng I-P dương nhỏ tương đối đồng nhất giữa các chế độ đông dữ liệu. Khoảng trống này được lấp ở cấp doanh nghiệp: phân tích đa quốc gia (Mục 4.3) cho thấy ICRV điều tiết quan hệ I-P một cách</w:t>
+      </w:r>
+      <w:r>
+        <w:t xml:space="preserve"> </w:t>
+      </w:r>
+      <w:r>
+        <w:rPr>
+          <w:bCs/>
+          <w:b/>
+        </w:rPr>
+        <w:t xml:space="preserve">có điều kiện</w:t>
+      </w:r>
+      <w:r>
+        <w:t xml:space="preserve"> </w:t>
+      </w:r>
+      <w:r>
+        <w:t xml:space="preserve">(qua các số hạng tương tác FSTS×ICRV và FSTS²×ICRV), tức là tính ngữ cảnh thể chế chỉ bộc lộ khi được mô hình hóa dưới dạng tương tác, chứ không phải dưới dạng so sánh chủ hiệu ứng phân nhóm ở cấp văn liệu.</w:t>
       </w:r>
     </w:p>
     <w:p>
@@ -28453,27 +28728,51 @@
         </m:r>
       </m:oMath>
       <w:r>
-        <w:t xml:space="preserve">). Các kết quả không có ý nghĩa này có thể phản ánh hạn chế về công suất ở cấp phân tích tổng hợp với</w:t>
-      </w:r>
-      <w:r>
-        <w:t xml:space="preserve"> </w:t>
-      </w:r>
-      <m:oMath>
-        <m:r>
-          <m:t>k</m:t>
-        </m:r>
-        <m:r>
-          <m:rPr>
-            <m:sty m:val="p"/>
-          </m:rPr>
-          <m:t>=</m:t>
-        </m:r>
-        <m:r>
-          <m:t>238</m:t>
-        </m:r>
-      </m:oMath>
-      <w:r>
-        <w:t xml:space="preserve">, đồng thời để ngỏ việc kiểm định vai trò số ở cấp doanh nghiệp cho phân tích đa quốc gia.</w:t>
+        <w:t xml:space="preserve">). Như vậy, giống ICRV, các yếu tố số ở cấp quốc gia cũng không dịch chuyển quan hệ I-P dưới dạng</w:t>
+      </w:r>
+      <w:r>
+        <w:t xml:space="preserve"> </w:t>
+      </w:r>
+      <w:r>
+        <w:rPr>
+          <w:bCs/>
+          <w:b/>
+        </w:rPr>
+        <w:t xml:space="preserve">chủ hiệu ứng điều tiết</w:t>
+      </w:r>
+      <w:r>
+        <w:t xml:space="preserve"> </w:t>
+      </w:r>
+      <w:r>
+        <w:t xml:space="preserve">ở cấp văn liệu. Mẫu hình thống nhất này — không một chủ hiệu ứng điều tiết nào (thể chế hay số) robust ở cấp tổng hợp — chính là cơ sở để chuyển sang đặc tả</w:t>
+      </w:r>
+      <w:r>
+        <w:t xml:space="preserve"> </w:t>
+      </w:r>
+      <w:r>
+        <w:rPr>
+          <w:bCs/>
+          <w:b/>
+        </w:rPr>
+        <w:t xml:space="preserve">có điều kiện</w:t>
+      </w:r>
+      <w:r>
+        <w:t xml:space="preserve">: vai trò số chỉ được kỳ vọng bộc lộ khi tương tác với bối cảnh thể chế (cơ chế</w:t>
+      </w:r>
+      <w:r>
+        <w:t xml:space="preserve"> </w:t>
+      </w:r>
+      <w:r>
+        <w:t xml:space="preserve">“</w:t>
+      </w:r>
+      <w:r>
+        <w:t xml:space="preserve">thay thế số cho thể chế</w:t>
+      </w:r>
+      <w:r>
+        <w:t xml:space="preserve">”</w:t>
+      </w:r>
+      <w:r>
+        <w:t xml:space="preserve">, DAI×ICRV), điều được kiểm định trực tiếp ở cấp doanh nghiệp trong phân tích đa quốc gia và là đóng góp thực nghiệm cốt lõi của luận án.</w:t>
       </w:r>
     </w:p>
     <w:bookmarkEnd w:id="114"/>
@@ -29847,7 +30146,79 @@
         <w:pStyle w:val="BodyText"/>
       </w:pPr>
       <w:r>
-        <w:t xml:space="preserve">Kiểm định điều tiết tổng thể về ICRV trong phân tích đa quốc gia nhất quán với kết quả phân tích tổng hợp ở phân tích tổng hợp (</w:t>
+        <w:t xml:space="preserve">Điều quan trọng cần làm rõ là quan hệ giữa hai cấp bằng chứng. Điều tiết thể chế ở cấp doanh nghiệp — qua hai số hạng tương tác FSTS×ICRV và FSTS²×ICRV (đều</w:t>
+      </w:r>
+      <w:r>
+        <w:t xml:space="preserve"> </w:t>
+      </w:r>
+      <m:oMath>
+        <m:r>
+          <m:t>p</m:t>
+        </m:r>
+        <m:r>
+          <m:rPr>
+            <m:sty m:val="p"/>
+          </m:rPr>
+          <m:t>&lt;</m:t>
+        </m:r>
+        <m:r>
+          <m:rPr>
+            <m:sty m:val="p"/>
+          </m:rPr>
+          <m:t>,</m:t>
+        </m:r>
+        <m:r>
+          <m:t>001</m:t>
+        </m:r>
+      </m:oMath>
+      <w:r>
+        <w:t xml:space="preserve">) — là</w:t>
+      </w:r>
+      <w:r>
+        <w:t xml:space="preserve"> </w:t>
+      </w:r>
+      <w:r>
+        <w:rPr>
+          <w:bCs/>
+          <w:b/>
+        </w:rPr>
+        <w:t xml:space="preserve">robust</w:t>
+      </w:r>
+      <w:r>
+        <w:t xml:space="preserve"> </w:t>
+      </w:r>
+      <w:r>
+        <w:t xml:space="preserve">và là kết quả trọng tâm của phân tích đa quốc gia. Trong khi đó, điều tiết thể chế ở cấp văn liệu (omnibus phân nhóm ICRV trong phân tích tổng hợp) lại</w:t>
+      </w:r>
+      <w:r>
+        <w:t xml:space="preserve"> </w:t>
+      </w:r>
+      <w:r>
+        <w:rPr>
+          <w:bCs/>
+          <w:b/>
+        </w:rPr>
+        <w:t xml:space="preserve">không bền vững</w:t>
+      </w:r>
+      <w:r>
+        <w:t xml:space="preserve">: như đã chỉ ra ở Mục 4.2.3, bỏ ô Frontier (</w:t>
+      </w:r>
+      <m:oMath>
+        <m:r>
+          <m:t>K</m:t>
+        </m:r>
+        <m:r>
+          <m:rPr>
+            <m:sty m:val="p"/>
+          </m:rPr>
+          <m:t>=</m:t>
+        </m:r>
+        <m:r>
+          <m:t>3</m:t>
+        </m:r>
+      </m:oMath>
+      <w:r>
+        <w:t xml:space="preserve">) thì omnibus về không có ý nghĩa (</w:t>
       </w:r>
       <m:oMath>
         <m:sSub>
@@ -29869,7 +30240,7 @@
           <m:t>=</m:t>
         </m:r>
         <m:r>
-          <m:t>17</m:t>
+          <m:t>1</m:t>
         </m:r>
         <m:r>
           <m:rPr>
@@ -29878,7 +30249,7 @@
           <m:t>,</m:t>
         </m:r>
         <m:r>
-          <m:t>35</m:t>
+          <m:t>49</m:t>
         </m:r>
       </m:oMath>
       <w:r>
@@ -29904,11 +30275,24 @@
           <m:t>,</m:t>
         </m:r>
         <m:r>
-          <m:t>002</m:t>
+          <m:t>68</m:t>
         </m:r>
       </m:oMath>
       <w:r>
-        <w:t xml:space="preserve">). Hai nguồn bằng chứng độc lập, một từ phân tích tổng hợp 238 nghiên cứu và một từ dữ liệu sơ cấp 45 nền kinh tế, cùng chỉ ra dải biến thiên ICRV, tạo nên một sự xác nhận chéo độc lập có giá trị.</w:t>
+        <w:t xml:space="preserve">). Hai cấp phân tích vì vậy</w:t>
+      </w:r>
+      <w:r>
+        <w:t xml:space="preserve"> </w:t>
+      </w:r>
+      <w:r>
+        <w:rPr>
+          <w:bCs/>
+          <w:b/>
+        </w:rPr>
+        <w:t xml:space="preserve">bổ sung chứ không trùng lặp</w:t>
+      </w:r>
+      <w:r>
+        <w:t xml:space="preserve">: đặc tả có điều kiện (tương tác) ở cấp doanh nghiệp làm lộ ra vai trò điều tiết của chế độ thể chế mà việc gộp chủ hiệu ứng phân nhóm ở cấp tổng hợp không phát hiện được một cách robust. Đây chính là giá trị gia tăng cốt lõi của phân tích sơ cấp 45 nền kinh tế so với tổng hợp văn liệu hiện có, và là lý do biện minh cho việc luận án không dừng ở meta-analysis mà tiến đến mô hình hóa tương tác ở cấp vi mô.</w:t>
       </w:r>
     </w:p>
     <w:bookmarkEnd w:id="118"/>
@@ -36647,94 +37031,7 @@
               <w:jc w:val="left"/>
             </w:pPr>
             <w:r>
-              <w:t xml:space="preserve">Xác nhận:</w:t>
-            </w:r>
-            <w:r>
-              <w:t xml:space="preserve"> </w:t>
-            </w:r>
-            <m:oMath>
-              <m:sSub>
-                <m:e>
-                  <m:r>
-                    <m:t>Q</m:t>
-                  </m:r>
-                </m:e>
-                <m:sub>
-                  <m:r>
-                    <m:t>M</m:t>
-                  </m:r>
-                </m:sub>
-              </m:sSub>
-              <m:r>
-                <m:rPr>
-                  <m:sty m:val="p"/>
-                </m:rPr>
-                <m:t>=</m:t>
-              </m:r>
-              <m:r>
-                <m:t>17</m:t>
-              </m:r>
-              <m:r>
-                <m:rPr>
-                  <m:sty m:val="p"/>
-                </m:rPr>
-                <m:t>,</m:t>
-              </m:r>
-              <m:r>
-                <m:t>35</m:t>
-              </m:r>
-            </m:oMath>
-            <w:r>
-              <w:t xml:space="preserve"> </w:t>
-            </w:r>
-            <w:r>
-              <w:t xml:space="preserve">(</w:t>
-            </w:r>
-            <m:oMath>
-              <m:r>
-                <m:t>d</m:t>
-              </m:r>
-              <m:r>
-                <m:t>f</m:t>
-              </m:r>
-              <m:r>
-                <m:rPr>
-                  <m:sty m:val="p"/>
-                </m:rPr>
-                <m:t>=</m:t>
-              </m:r>
-              <m:r>
-                <m:t>4</m:t>
-              </m:r>
-            </m:oMath>
-            <w:r>
-              <w:t xml:space="preserve">,</w:t>
-            </w:r>
-            <w:r>
-              <w:t xml:space="preserve"> </w:t>
-            </w:r>
-            <m:oMath>
-              <m:r>
-                <m:t>p</m:t>
-              </m:r>
-              <m:r>
-                <m:rPr>
-                  <m:sty m:val="p"/>
-                </m:rPr>
-                <m:t>=</m:t>
-              </m:r>
-              <m:r>
-                <m:rPr>
-                  <m:sty m:val="p"/>
-                </m:rPr>
-                <m:t>,</m:t>
-              </m:r>
-              <m:r>
-                <m:t>002</m:t>
-              </m:r>
-            </m:oMath>
-            <w:r>
-              <w:t xml:space="preserve">) từ phân tích tổng hợp và tương tác M10 từ phân tích đa quốc gia (FSTS×ICRV</w:t>
+              <w:t xml:space="preserve">Xác nhận ở cấp doanh nghiệp qua tương tác có điều kiện M10 (FSTS×ICRV</w:t>
             </w:r>
             <w:r>
               <w:t xml:space="preserve"> </w:t>
@@ -36847,7 +37144,148 @@
               </m:r>
             </m:oMath>
             <w:r>
-              <w:t xml:space="preserve">); cơ chế là độ cong/biên độ (sâu dần khi thể chế suy giảm), không phải dịch chuyển điểm uốn đơn điệu</w:t>
+              <w:t xml:space="preserve">). Ở cấp phân tích tổng hợp, omnibus ICRV</w:t>
+            </w:r>
+            <w:r>
+              <w:t xml:space="preserve"> </w:t>
+            </w:r>
+            <w:r>
+              <w:rPr>
+                <w:bCs/>
+                <w:b/>
+              </w:rPr>
+              <w:t xml:space="preserve">không bền vững</w:t>
+            </w:r>
+            <w:r>
+              <w:t xml:space="preserve"> </w:t>
+            </w:r>
+            <w:r>
+              <w:t xml:space="preserve">(</w:t>
+            </w:r>
+            <m:oMath>
+              <m:sSub>
+                <m:e>
+                  <m:r>
+                    <m:t>Q</m:t>
+                  </m:r>
+                </m:e>
+                <m:sub>
+                  <m:r>
+                    <m:t>M</m:t>
+                  </m:r>
+                </m:sub>
+              </m:sSub>
+              <m:r>
+                <m:rPr>
+                  <m:sty m:val="p"/>
+                </m:rPr>
+                <m:t>=</m:t>
+              </m:r>
+              <m:r>
+                <m:t>17</m:t>
+              </m:r>
+              <m:r>
+                <m:rPr>
+                  <m:sty m:val="p"/>
+                </m:rPr>
+                <m:t>,</m:t>
+              </m:r>
+              <m:r>
+                <m:t>35</m:t>
+              </m:r>
+            </m:oMath>
+            <w:r>
+              <w:t xml:space="preserve"> </w:t>
+            </w:r>
+            <w:r>
+              <w:t xml:space="preserve">nhưng bỏ ô Frontier</w:t>
+            </w:r>
+            <w:r>
+              <w:t xml:space="preserve"> </w:t>
+            </w:r>
+            <m:oMath>
+              <m:r>
+                <m:t>K</m:t>
+              </m:r>
+              <m:r>
+                <m:rPr>
+                  <m:sty m:val="p"/>
+                </m:rPr>
+                <m:t>=</m:t>
+              </m:r>
+              <m:r>
+                <m:t>3</m:t>
+              </m:r>
+            </m:oMath>
+            <w:r>
+              <w:t xml:space="preserve"> </w:t>
+            </w:r>
+            <w:r>
+              <w:t xml:space="preserve">→</w:t>
+            </w:r>
+            <w:r>
+              <w:t xml:space="preserve"> </w:t>
+            </w:r>
+            <m:oMath>
+              <m:sSub>
+                <m:e>
+                  <m:r>
+                    <m:t>Q</m:t>
+                  </m:r>
+                </m:e>
+                <m:sub>
+                  <m:r>
+                    <m:t>M</m:t>
+                  </m:r>
+                </m:sub>
+              </m:sSub>
+              <m:r>
+                <m:rPr>
+                  <m:sty m:val="p"/>
+                </m:rPr>
+                <m:t>=</m:t>
+              </m:r>
+              <m:r>
+                <m:t>1</m:t>
+              </m:r>
+              <m:r>
+                <m:rPr>
+                  <m:sty m:val="p"/>
+                </m:rPr>
+                <m:t>,</m:t>
+              </m:r>
+              <m:r>
+                <m:t>49</m:t>
+              </m:r>
+            </m:oMath>
+            <w:r>
+              <w:t xml:space="preserve">,</w:t>
+            </w:r>
+            <w:r>
+              <w:t xml:space="preserve"> </w:t>
+            </w:r>
+            <m:oMath>
+              <m:r>
+                <m:t>p</m:t>
+              </m:r>
+              <m:r>
+                <m:rPr>
+                  <m:sty m:val="p"/>
+                </m:rPr>
+                <m:t>=</m:t>
+              </m:r>
+              <m:r>
+                <m:rPr>
+                  <m:sty m:val="p"/>
+                </m:rPr>
+                <m:t>,</m:t>
+              </m:r>
+              <m:r>
+                <m:t>68</m:t>
+              </m:r>
+            </m:oMath>
+            <w:r>
+              <w:t xml:space="preserve">): điều tiết thể chế chỉ bộc lộ robust khi mô hình hóa tương tác, không phải khi so sánh chủ hiệu ứng phân nhóm. Cơ chế là độ cong/biên độ (sâu dần khi thể chế suy giảm), không phải dịch chuyển điểm uốn đơn điệu</w:t>
             </w:r>
           </w:p>
         </w:tc>
@@ -37787,10 +38225,7 @@
         <w:t xml:space="preserve">dải biến thiên ICRV (Institutional Context Regime Variation, biến thiên chế độ bối cảnh thể chế)</w:t>
       </w:r>
       <w:r>
-        <w:t xml:space="preserve">: cùng một mức độ quốc tế hóa (FSTS) lại mang lại hiệu quả rất khác nhau, tùy vào chế độ thể chế mà doanh nghiệp hoạt động. Hai nguồn bằng chứng độc lập cùng chỉ về một kết luận, đó là phân tích tổng hợp (phân tích tổng hợp,</w:t>
-      </w:r>
-      <w:r>
-        <w:t xml:space="preserve"> </w:t>
+        <w:t xml:space="preserve">: cùng một mức độ quốc tế hóa (FSTS) lại mang lại hiệu quả rất khác nhau, tùy vào chế độ thể chế mà doanh nghiệp hoạt động. Hai nguồn bằng chứng bổ sung cho nhau cùng chỉ về vai trò quyết định của chế độ thể chế, song ở hai cấp độ khác nhau. Ở cấp tổng hợp, phân tích tổng hợp xác nhận chế độ thể chế là yếu tố điều tiết có ý nghĩa của quan hệ gộp I-P (</w:t>
       </w:r>
       <m:oMath>
         <m:sSub>
@@ -37874,7 +38309,143 @@
         </m:r>
       </m:oMath>
       <w:r>
-        <w:t xml:space="preserve">) và phân tích dữ liệu sơ cấp toàn mẫu (phân tích đa quốc gia,</w:t>
+        <w:t xml:space="preserve">), tức các chế độ</w:t>
+      </w:r>
+      <w:r>
+        <w:t xml:space="preserve"> </w:t>
+      </w:r>
+      <w:r>
+        <w:rPr>
+          <w:bCs/>
+          <w:b/>
+        </w:rPr>
+        <w:t xml:space="preserve">khác biệt</w:t>
+      </w:r>
+      <w:r>
+        <w:t xml:space="preserve"> </w:t>
+      </w:r>
+      <w:r>
+        <w:t xml:space="preserve">nhau; bản thân kiểm định này chưa xác lập một dải biến thiên đơn điệu theo chất lượng thể chế, và thực ra</w:t>
+      </w:r>
+      <w:r>
+        <w:t xml:space="preserve"> </w:t>
+      </w:r>
+      <w:r>
+        <w:rPr>
+          <w:bCs/>
+          <w:b/>
+        </w:rPr>
+        <w:t xml:space="preserve">không bền vững</w:t>
+      </w:r>
+      <w:r>
+        <w:t xml:space="preserve">: ý nghĩa</w:t>
+      </w:r>
+      <w:r>
+        <w:t xml:space="preserve"> </w:t>
+      </w:r>
+      <m:oMath>
+        <m:sSub>
+          <m:e>
+            <m:r>
+              <m:t>Q</m:t>
+            </m:r>
+          </m:e>
+          <m:sub>
+            <m:r>
+              <m:t>M</m:t>
+            </m:r>
+          </m:sub>
+        </m:sSub>
+      </m:oMath>
+      <w:r>
+        <w:t xml:space="preserve"> </w:t>
+      </w:r>
+      <w:r>
+        <w:t xml:space="preserve">gần như hoàn toàn do ô Frontier mỏng (k = 3) tạo ra, bỏ ô này thì omnibus về không có ý nghĩa (</w:t>
+      </w:r>
+      <m:oMath>
+        <m:sSub>
+          <m:e>
+            <m:r>
+              <m:t>Q</m:t>
+            </m:r>
+          </m:e>
+          <m:sub>
+            <m:r>
+              <m:t>M</m:t>
+            </m:r>
+          </m:sub>
+        </m:sSub>
+        <m:r>
+          <m:rPr>
+            <m:sty m:val="p"/>
+          </m:rPr>
+          <m:t>=</m:t>
+        </m:r>
+        <m:r>
+          <m:t>1</m:t>
+        </m:r>
+        <m:r>
+          <m:rPr>
+            <m:sty m:val="p"/>
+          </m:rPr>
+          <m:t>,</m:t>
+        </m:r>
+        <m:r>
+          <m:t>49</m:t>
+        </m:r>
+      </m:oMath>
+      <w:r>
+        <w:t xml:space="preserve">,</w:t>
+      </w:r>
+      <w:r>
+        <w:t xml:space="preserve"> </w:t>
+      </w:r>
+      <m:oMath>
+        <m:r>
+          <m:t>d</m:t>
+        </m:r>
+        <m:r>
+          <m:t>f</m:t>
+        </m:r>
+        <m:r>
+          <m:rPr>
+            <m:sty m:val="p"/>
+          </m:rPr>
+          <m:t>=</m:t>
+        </m:r>
+        <m:r>
+          <m:t>3</m:t>
+        </m:r>
+      </m:oMath>
+      <w:r>
+        <w:t xml:space="preserve">,</w:t>
+      </w:r>
+      <w:r>
+        <w:t xml:space="preserve"> </w:t>
+      </w:r>
+      <m:oMath>
+        <m:r>
+          <m:t>p</m:t>
+        </m:r>
+        <m:r>
+          <m:rPr>
+            <m:sty m:val="p"/>
+          </m:rPr>
+          <m:t>=</m:t>
+        </m:r>
+        <m:r>
+          <m:rPr>
+            <m:sty m:val="p"/>
+          </m:rPr>
+          <m:t>,</m:t>
+        </m:r>
+        <m:r>
+          <m:t>68</m:t>
+        </m:r>
+      </m:oMath>
+      <w:r>
+        <w:t xml:space="preserve">). Hình dạng cụ thể của dải biến thiên được xác lập độc lập bằng dữ liệu sơ cấp toàn mẫu (phân tích đa quốc gia,</w:t>
       </w:r>
       <w:r>
         <w:t xml:space="preserve"> </w:t>
@@ -40912,7 +41483,7 @@
         <w:pStyle w:val="FirstParagraph"/>
       </w:pPr>
       <w:r>
-        <w:t xml:space="preserve">Về lý thuyết, luận án đóng góp vào ba dòng nghiên cứu. Với dòng phân tích tổng hợp về quan hệ I-P, luận án phân tách cấu trúc dị biệt và xác định ICRV như một yếu tố điều tiết có ý nghĩa. Với dòng nghiên cứu về năng lực số, luận án làm rõ rằng DAI là nguồn lực tình huống chứ không phải năng lực nền tảng. Và với dòng nghiên cứu về quốc tế hóa và các nền kinh tế đảo nhỏ, luận án đặt tên cùng cung cấp bằng chứng đầu tiên cho FIP.</w:t>
+        <w:t xml:space="preserve">Về lý thuyết, luận án đóng góp vào ba dòng nghiên cứu. Với dòng phân tích tổng hợp về quan hệ I-P, luận án phân tách cấu trúc dị biệt và cho thấy điều tiết thể chế trực tiếp ở cấp văn liệu là yếu/không bền vững, trong khi vai trò điều tiết của ICRV chỉ bộc lộ robust ở cấp doanh nghiệp qua tương tác có điều kiện. Với dòng nghiên cứu về năng lực số, luận án làm rõ rằng DAI là nguồn lực tình huống chứ không phải năng lực nền tảng. Và với dòng nghiên cứu về quốc tế hóa và các nền kinh tế đảo nhỏ, luận án đặt tên cùng cung cấp bằng chứng đầu tiên cho FIP.</w:t>
       </w:r>
     </w:p>
     <w:p>

</xml_diff>